<commit_message>
Rebuild paraphraser tool engine (v2) and audit paraphrasing article: add when-to-use section, tool screenshot, fix source wording, unique FAQ
Co-Authored-By: Claude Opus 5.5 <noreply@anthropic.com>
Claude-Session: https://claude.ai/code/session_01GQXcnZLn4f9MkUS7SEqp5J
</commit_message>
<xml_diff>
--- a/blog-content/AI-Paraphrasing-vs-Rewriting.docx
+++ b/blog-content/AI-Paraphrasing-vs-Rewriting.docx
@@ -622,7 +622,7 @@
         </w:rPr>
         <w:t xml:space="preserve">Related terms cause the rest of the confusion. Rewording swaps individual words for synonyms and leaves the sentence alone. Summarising keeps only the main points, so it is always shorter than the source. Rephrasing is the loosest of the lot: Scribbr's guide to </w:t>
       </w:r>
-      <w:hyperlink w:history="1" r:id="rIdtxk1ffwevx_ak2l8vjtwc">
+      <w:hyperlink w:history="1" r:id="rIdaziu9tasjjudsqzzncxjf">
         <w:r>
           <w:rPr>
             <w:rStyle w:val="Hyperlink"/>
@@ -1220,7 +1220,7 @@
           <w:sz w:val="24"/>
           <w:szCs w:val="24"/>
         </w:rPr>
-        <w:t xml:space="preserve">I measured overlap by comparing word sequences, the same basic idea plagiarism checkers use to match text. The takeaway: a paraphrase can look completely new at the phrase level while still following the source sentence by sentence. That is exactly why it still needs a citation.</w:t>
+        <w:t xml:space="preserve">I measured overlap by comparing 5-word sequences, a simplified version of how plagiarism checkers match text. The takeaway: a paraphrase can look completely new at the phrase level while still following the source sentence by sentence. That is exactly why it still needs a citation.</w:t>
       </w:r>
     </w:p>
     <w:p>
@@ -1237,676 +1237,21 @@
           <w:sz w:val="36"/>
           <w:szCs w:val="36"/>
         </w:rPr>
-        <w:t xml:space="preserve">Is paraphrasing considered plagiarism?</w:t>
-      </w:r>
-    </w:p>
-    <w:p>
-      <w:pPr>
-        <w:spacing w:after="160"/>
-      </w:pPr>
-      <w:r>
-        <w:rPr>
-          <w:rFonts w:ascii="Calibri" w:cs="Calibri" w:eastAsia="Calibri" w:hAnsi="Calibri"/>
-          <w:color w:val="333333"/>
-          <w:sz w:val="24"/>
-          <w:szCs w:val="24"/>
-        </w:rPr>
-        <w:t xml:space="preserve">Paraphrasing is not plagiarism when you credit the source and genuinely restate the idea in your own words. It becomes plagiarism when you skip the credit, or when you only swap a few words and keep the author's sentence structure.</w:t>
-      </w:r>
-    </w:p>
-    <w:p>
-      <w:pPr>
-        <w:spacing w:after="160"/>
-      </w:pPr>
-      <w:r>
-        <w:rPr>
-          <w:rFonts w:ascii="Calibri" w:cs="Calibri" w:eastAsia="Calibri" w:hAnsi="Calibri"/>
-          <w:color w:val="333333"/>
-          <w:sz w:val="24"/>
-          <w:szCs w:val="24"/>
-        </w:rPr>
-        <w:t xml:space="preserve">Scribbr's guidance on </w:t>
-      </w:r>
-      <w:hyperlink w:history="1" r:id="rId7jlluei-bg5wsvc0b4az9">
-        <w:r>
-          <w:rPr>
-            <w:rStyle w:val="Hyperlink"/>
-            <w:rFonts w:ascii="Calibri" w:cs="Calibri" w:eastAsia="Calibri" w:hAnsi="Calibri"/>
-            <w:color w:val="0563C1"/>
-            <w:sz w:val="24"/>
-            <w:szCs w:val="24"/>
-            <w:u w:val="single"/>
-          </w:rPr>
-          <w:t xml:space="preserve">whether paraphrasing is plagiarism</w:t>
-        </w:r>
-      </w:hyperlink>
-      <w:r>
-        <w:rPr>
-          <w:rFonts w:ascii="Calibri" w:cs="Calibri" w:eastAsia="Calibri" w:hAnsi="Calibri"/>
-          <w:color w:val="333333"/>
-          <w:sz w:val="24"/>
-          <w:szCs w:val="24"/>
-        </w:rPr>
-        <w:t xml:space="preserve"> makes the same point: rearranging an author's words or inserting a few synonyms still counts as plagiarism, even with a citation. My spinner result shows why. With 83% of its 5-word phrases unchanged, that text would match the original in any checker.</w:t>
-      </w:r>
-    </w:p>
-    <w:p>
-      <w:pPr>
-        <w:spacing w:after="160"/>
-      </w:pPr>
-      <w:r>
-        <w:rPr>
-          <w:rFonts w:ascii="Calibri" w:cs="Calibri" w:eastAsia="Calibri" w:hAnsi="Calibri"/>
-          <w:color w:val="333333"/>
-          <w:sz w:val="24"/>
-          <w:szCs w:val="24"/>
-        </w:rPr>
-        <w:t xml:space="preserve">Rewriting follows the same rule. If the ideas, research or structure came from someone else, credit them. Changing every word doesn't make an idea yours.</w:t>
-      </w:r>
-    </w:p>
-    <w:p>
-      <w:pPr>
-        <w:pStyle w:val="Heading2"/>
-        <w:spacing w:after="120" w:before="300"/>
-      </w:pPr>
-      <w:r>
-        <w:rPr>
-          <w:rFonts w:ascii="Calibri" w:cs="Calibri" w:eastAsia="Calibri" w:hAnsi="Calibri"/>
-          <w:b/>
-          <w:bCs/>
-          <w:color w:val="7C3AED"/>
-          <w:sz w:val="36"/>
-          <w:szCs w:val="36"/>
-        </w:rPr>
-        <w:t xml:space="preserve">Can AI paraphrase without plagiarism?</w:t>
-      </w:r>
-    </w:p>
-    <w:p>
-      <w:pPr>
-        <w:spacing w:after="160"/>
-      </w:pPr>
-      <w:r>
-        <w:rPr>
-          <w:rFonts w:ascii="Calibri" w:cs="Calibri" w:eastAsia="Calibri" w:hAnsi="Calibri"/>
-          <w:color w:val="333333"/>
-          <w:sz w:val="24"/>
-          <w:szCs w:val="24"/>
-        </w:rPr>
-        <w:t xml:space="preserve">Yes, if the AI changes sentence structure as well as words, you check the output, and you still cite the source of the idea. The risk comes from tools that only swap synonyms, and from people using any tool to hide where a text came from.</w:t>
-      </w:r>
-    </w:p>
-    <w:p>
-      <w:pPr>
-        <w:spacing w:after="160"/>
-      </w:pPr>
-      <w:r>
-        <w:rPr>
-          <w:rFonts w:ascii="Calibri" w:cs="Calibri" w:eastAsia="Calibri" w:hAnsi="Calibri"/>
-          <w:color w:val="333333"/>
-          <w:sz w:val="24"/>
-          <w:szCs w:val="24"/>
-        </w:rPr>
-        <w:t xml:space="preserve">Two changes since 2025 matter here:</w:t>
-      </w:r>
-    </w:p>
-    <w:p>
-      <w:pPr>
-        <w:pStyle w:val="ListParagraph"/>
-        <w:numPr>
-          <w:ilvl w:val="0"/>
-          <w:numId w:val="1"/>
-        </w:numPr>
-      </w:pPr>
-      <w:r>
-        <w:rPr>
-          <w:rFonts w:ascii="Calibri" w:cs="Calibri" w:eastAsia="Calibri" w:hAnsi="Calibri"/>
-          <w:b/>
-          <w:bCs/>
-          <w:color w:val="333333"/>
-          <w:sz w:val="24"/>
-          <w:szCs w:val="24"/>
-        </w:rPr>
-        <w:t xml:space="preserve">Turnitin now looks for disguised AI text.</w:t>
-      </w:r>
-      <w:r>
-        <w:rPr>
-          <w:rFonts w:ascii="Calibri" w:cs="Calibri" w:eastAsia="Calibri" w:hAnsi="Calibri"/>
-          <w:color w:val="333333"/>
-          <w:sz w:val="24"/>
-          <w:szCs w:val="24"/>
-        </w:rPr>
-        <w:t xml:space="preserve"> On 27 August 2025, Turnitin </w:t>
-      </w:r>
-      <w:hyperlink w:history="1" r:id="rIdvnvvu5hugp5txxr2nz7qj">
-        <w:r>
-          <w:rPr>
-            <w:rStyle w:val="Hyperlink"/>
-            <w:rFonts w:ascii="Calibri" w:cs="Calibri" w:eastAsia="Calibri" w:hAnsi="Calibri"/>
-            <w:color w:val="0563C1"/>
-            <w:sz w:val="24"/>
-            <w:szCs w:val="24"/>
-            <w:u w:val="single"/>
-          </w:rPr>
-          <w:t xml:space="preserve">launched AI bypasser detection</w:t>
-        </w:r>
-      </w:hyperlink>
-      <w:r>
-        <w:rPr>
-          <w:rFonts w:ascii="Calibri" w:cs="Calibri" w:eastAsia="Calibri" w:hAnsi="Calibri"/>
-          <w:color w:val="333333"/>
-          <w:sz w:val="24"/>
-          <w:szCs w:val="24"/>
-        </w:rPr>
-        <w:t xml:space="preserve">, trained on the patterns left by humanizer and rewording tools. Running AI text through a paraphraser is no longer a reliable way to hide it.</w:t>
-      </w:r>
-    </w:p>
-    <w:p>
-      <w:pPr>
-        <w:pStyle w:val="ListParagraph"/>
-        <w:numPr>
-          <w:ilvl w:val="0"/>
-          <w:numId w:val="1"/>
-        </w:numPr>
-      </w:pPr>
-      <w:r>
-        <w:rPr>
-          <w:rFonts w:ascii="Calibri" w:cs="Calibri" w:eastAsia="Calibri" w:hAnsi="Calibri"/>
-          <w:b/>
-          <w:bCs/>
-          <w:color w:val="333333"/>
-          <w:sz w:val="24"/>
-          <w:szCs w:val="24"/>
-        </w:rPr>
-        <w:t xml:space="preserve">Google names synonym swapping as spam.</w:t>
-      </w:r>
-      <w:r>
-        <w:rPr>
-          <w:rFonts w:ascii="Calibri" w:cs="Calibri" w:eastAsia="Calibri" w:hAnsi="Calibri"/>
-          <w:color w:val="333333"/>
-          <w:sz w:val="24"/>
-          <w:szCs w:val="24"/>
-        </w:rPr>
-        <w:t xml:space="preserve"> Google's </w:t>
-      </w:r>
-      <w:hyperlink w:history="1" r:id="rIdmh4nm5ucjw6x724tfy40v">
-        <w:r>
-          <w:rPr>
-            <w:rStyle w:val="Hyperlink"/>
-            <w:rFonts w:ascii="Calibri" w:cs="Calibri" w:eastAsia="Calibri" w:hAnsi="Calibri"/>
-            <w:color w:val="0563C1"/>
-            <w:sz w:val="24"/>
-            <w:szCs w:val="24"/>
-            <w:u w:val="single"/>
-          </w:rPr>
-          <w:t xml:space="preserve">spam policies</w:t>
-        </w:r>
-      </w:hyperlink>
-      <w:r>
-        <w:rPr>
-          <w:rFonts w:ascii="Calibri" w:cs="Calibri" w:eastAsia="Calibri" w:hAnsi="Calibri"/>
-          <w:color w:val="333333"/>
-          <w:sz w:val="24"/>
-          <w:szCs w:val="24"/>
-        </w:rPr>
-        <w:t xml:space="preserve">, updated in August 2026, list copying content and modifying it "only slightly (for example, by substituting synonyms or using automated techniques)" as scraping.</w:t>
-      </w:r>
-    </w:p>
-    <w:p>
-      <w:pPr>
-        <w:spacing w:after="160"/>
-      </w:pPr>
-      <w:r>
-        <w:rPr>
-          <w:rFonts w:ascii="Calibri" w:cs="Calibri" w:eastAsia="Calibri" w:hAnsi="Calibri"/>
-          <w:color w:val="333333"/>
-          <w:sz w:val="24"/>
-          <w:szCs w:val="24"/>
-        </w:rPr>
-        <w:t xml:space="preserve">The safe way to use AI for either job:</w:t>
-      </w:r>
-    </w:p>
-    <w:p>
-      <w:pPr>
-        <w:spacing w:after="160"/>
-      </w:pPr>
-      <w:r>
-        <w:rPr>
-          <w:rFonts w:ascii="Calibri" w:cs="Calibri" w:eastAsia="Calibri" w:hAnsi="Calibri"/>
-          <w:color w:val="333333"/>
-          <w:sz w:val="24"/>
-          <w:szCs w:val="24"/>
-        </w:rPr>
-        <w:t xml:space="preserve">1. Feed it your own draft or notes, not someone else's article.</w:t>
-      </w:r>
-    </w:p>
-    <w:p>
-      <w:pPr>
-        <w:spacing w:after="160"/>
-      </w:pPr>
-      <w:r>
-        <w:rPr>
-          <w:rFonts w:ascii="Calibri" w:cs="Calibri" w:eastAsia="Calibri" w:hAnsi="Calibri"/>
-          <w:color w:val="333333"/>
-          <w:sz w:val="24"/>
-          <w:szCs w:val="24"/>
-        </w:rPr>
-        <w:t xml:space="preserve">2. Tell it which one you want. "Paraphrase this paragraph, same meaning and length" and "Rewrite this section for beginners, new structure, keep these facts" produce very different results.</w:t>
-      </w:r>
-    </w:p>
-    <w:p>
-      <w:pPr>
-        <w:spacing w:after="160"/>
-      </w:pPr>
-      <w:r>
-        <w:rPr>
-          <w:rFonts w:ascii="Calibri" w:cs="Calibri" w:eastAsia="Calibri" w:hAnsi="Calibri"/>
-          <w:color w:val="333333"/>
-          <w:sz w:val="24"/>
-          <w:szCs w:val="24"/>
-        </w:rPr>
-        <w:t xml:space="preserve">3. Read the output against the original. Put back any fact it dropped or changed.</w:t>
-      </w:r>
-    </w:p>
-    <w:p>
-      <w:pPr>
-        <w:spacing w:after="160"/>
-      </w:pPr>
-      <w:r>
-        <w:rPr>
-          <w:rFonts w:ascii="Calibri" w:cs="Calibri" w:eastAsia="Calibri" w:hAnsi="Calibri"/>
-          <w:color w:val="333333"/>
-          <w:sz w:val="24"/>
-          <w:szCs w:val="24"/>
-        </w:rPr>
-        <w:t xml:space="preserve">4. Cite every source whose idea you used.</w:t>
-      </w:r>
-    </w:p>
-    <w:p>
-      <w:pPr>
-        <w:spacing w:after="160"/>
-      </w:pPr>
-      <w:r>
-        <w:rPr>
-          <w:rFonts w:ascii="Calibri" w:cs="Calibri" w:eastAsia="Calibri" w:hAnsi="Calibri"/>
-          <w:color w:val="333333"/>
-          <w:sz w:val="24"/>
-          <w:szCs w:val="24"/>
-        </w:rPr>
-        <w:t xml:space="preserve">My guide on </w:t>
-      </w:r>
-      <w:hyperlink w:history="1" r:id="rIdrqy5uwdencwf7_3koyfmg">
-        <w:r>
-          <w:rPr>
-            <w:rStyle w:val="Hyperlink"/>
-            <w:rFonts w:ascii="Calibri" w:cs="Calibri" w:eastAsia="Calibri" w:hAnsi="Calibri"/>
-            <w:color w:val="0563C1"/>
-            <w:sz w:val="24"/>
-            <w:szCs w:val="24"/>
-            <w:u w:val="single"/>
-          </w:rPr>
-          <w:t xml:space="preserve">how to humanize AI content</w:t>
-        </w:r>
-      </w:hyperlink>
-      <w:r>
-        <w:rPr>
-          <w:rFonts w:ascii="Calibri" w:cs="Calibri" w:eastAsia="Calibri" w:hAnsi="Calibri"/>
-          <w:color w:val="333333"/>
-          <w:sz w:val="24"/>
-          <w:szCs w:val="24"/>
-        </w:rPr>
-        <w:t xml:space="preserve"> covers step 3 in detail.</w:t>
-      </w:r>
-    </w:p>
-    <w:p>
-      <w:pPr>
-        <w:pStyle w:val="Heading2"/>
-        <w:spacing w:after="120" w:before="300"/>
-      </w:pPr>
-      <w:r>
-        <w:rPr>
-          <w:rFonts w:ascii="Calibri" w:cs="Calibri" w:eastAsia="Calibri" w:hAnsi="Calibri"/>
-          <w:b/>
-          <w:bCs/>
-          <w:color w:val="7C3AED"/>
-          <w:sz w:val="36"/>
-          <w:szCs w:val="36"/>
-        </w:rPr>
-        <w:t xml:space="preserve">Does Google penalise paraphrased or rewritten content?</w:t>
-      </w:r>
-    </w:p>
-    <w:p>
-      <w:pPr>
-        <w:spacing w:after="160"/>
-      </w:pPr>
-      <w:r>
-        <w:rPr>
-          <w:rFonts w:ascii="Calibri" w:cs="Calibri" w:eastAsia="Calibri" w:hAnsi="Calibri"/>
-          <w:color w:val="333333"/>
-          <w:sz w:val="24"/>
-          <w:szCs w:val="24"/>
-        </w:rPr>
-        <w:t xml:space="preserve">Google doesn't penalise text for being paraphrased, rewritten or AI-assisted. It rates pages low when they add nothing new. The January 2025 update to Google's Search Quality Rater Guidelines gives the Lowest rating when almost all main content is "copied or paraphrased with no effort or added value", as </w:t>
-      </w:r>
-      <w:hyperlink w:history="1" r:id="rIdfnnzkpvnwa5ugvbntixsw">
-        <w:r>
-          <w:rPr>
-            <w:rStyle w:val="Hyperlink"/>
-            <w:rFonts w:ascii="Calibri" w:cs="Calibri" w:eastAsia="Calibri" w:hAnsi="Calibri"/>
-            <w:color w:val="0563C1"/>
-            <w:sz w:val="24"/>
-            <w:szCs w:val="24"/>
-            <w:u w:val="single"/>
-          </w:rPr>
-          <w:t xml:space="preserve">PPC Land's summary of the update</w:t>
-        </w:r>
-      </w:hyperlink>
-      <w:r>
-        <w:rPr>
-          <w:rFonts w:ascii="Calibri" w:cs="Calibri" w:eastAsia="Calibri" w:hAnsi="Calibri"/>
-          <w:color w:val="333333"/>
-          <w:sz w:val="24"/>
-          <w:szCs w:val="24"/>
-        </w:rPr>
-        <w:t xml:space="preserve"> quotes.</w:t>
-      </w:r>
-    </w:p>
-    <w:p>
-      <w:pPr>
-        <w:spacing w:after="160"/>
-      </w:pPr>
-      <w:r>
-        <w:rPr>
-          <w:rFonts w:ascii="Calibri" w:cs="Calibri" w:eastAsia="Calibri" w:hAnsi="Calibri"/>
-          <w:color w:val="333333"/>
-          <w:sz w:val="24"/>
-          <w:szCs w:val="24"/>
-        </w:rPr>
-        <w:t xml:space="preserve">So the question isn't "paraphrase or rewrite?" It's "what did I add?" For a blog, that usually means a rewrite plus something the source didn't have: your test, your data, your example.</w:t>
-      </w:r>
-    </w:p>
-    <w:p>
-      <w:pPr>
-        <w:pStyle w:val="Heading2"/>
-        <w:spacing w:after="120" w:before="300"/>
-      </w:pPr>
-      <w:r>
-        <w:rPr>
-          <w:rFonts w:ascii="Calibri" w:cs="Calibri" w:eastAsia="Calibri" w:hAnsi="Calibri"/>
-          <w:b/>
-          <w:bCs/>
-          <w:color w:val="7C3AED"/>
-          <w:sz w:val="36"/>
-          <w:szCs w:val="36"/>
-        </w:rPr>
-        <w:t xml:space="preserve">Which AI tool is best for paraphrasing vs rewriting?</w:t>
-      </w:r>
-    </w:p>
-    <w:p>
-      <w:pPr>
-        <w:spacing w:after="160"/>
-      </w:pPr>
-      <w:r>
-        <w:rPr>
-          <w:rFonts w:ascii="Calibri" w:cs="Calibri" w:eastAsia="Calibri" w:hAnsi="Calibri"/>
-          <w:color w:val="333333"/>
-          <w:sz w:val="24"/>
-          <w:szCs w:val="24"/>
-        </w:rPr>
-        <w:t xml:space="preserve">The best tool depends on the job. Sentence-level paraphrasers suit short passages. Chat-based AI suits full rewrites because you can tell it the audience, structure and facts to keep.</w:t>
-      </w:r>
-    </w:p>
-    <w:p>
-      <w:pPr>
-        <w:pStyle w:val="ListParagraph"/>
-        <w:numPr>
-          <w:ilvl w:val="0"/>
-          <w:numId w:val="1"/>
-        </w:numPr>
-      </w:pPr>
-      <w:r>
-        <w:rPr>
-          <w:rFonts w:ascii="Calibri" w:cs="Calibri" w:eastAsia="Calibri" w:hAnsi="Calibri"/>
-          <w:b/>
-          <w:bCs/>
-          <w:color w:val="333333"/>
-          <w:sz w:val="24"/>
-          <w:szCs w:val="24"/>
-        </w:rPr>
-        <w:t xml:space="preserve">QuillBot</w:t>
-      </w:r>
-      <w:r>
-        <w:rPr>
-          <w:rFonts w:ascii="Calibri" w:cs="Calibri" w:eastAsia="Calibri" w:hAnsi="Calibri"/>
-          <w:color w:val="333333"/>
-          <w:sz w:val="24"/>
-          <w:szCs w:val="24"/>
-        </w:rPr>
-        <w:t xml:space="preserve"> – the best-known paraphraser. The free plan handles 125 words at a time with the Standard and Fluency modes; Premium unlocks the other modes and removes the limit.</w:t>
-      </w:r>
-    </w:p>
-    <w:p>
-      <w:pPr>
-        <w:pStyle w:val="ListParagraph"/>
-        <w:numPr>
-          <w:ilvl w:val="0"/>
-          <w:numId w:val="1"/>
-        </w:numPr>
-      </w:pPr>
-      <w:r>
-        <w:rPr>
-          <w:rFonts w:ascii="Calibri" w:cs="Calibri" w:eastAsia="Calibri" w:hAnsi="Calibri"/>
-          <w:b/>
-          <w:bCs/>
-          <w:color w:val="333333"/>
-          <w:sz w:val="24"/>
-          <w:szCs w:val="24"/>
-        </w:rPr>
-        <w:t xml:space="preserve">Spinbot and other synonym spinners</w:t>
-      </w:r>
-      <w:r>
-        <w:rPr>
-          <w:rFonts w:ascii="Calibri" w:cs="Calibri" w:eastAsia="Calibri" w:hAnsi="Calibri"/>
-          <w:color w:val="333333"/>
-          <w:sz w:val="24"/>
-          <w:szCs w:val="24"/>
-        </w:rPr>
-        <w:t xml:space="preserve"> – swap words at speed. Fine for brainstorming alternative phrasings, risky for anything you publish, for the reasons my test showed.</w:t>
-      </w:r>
-    </w:p>
-    <w:p>
-      <w:pPr>
-        <w:pStyle w:val="ListParagraph"/>
-        <w:numPr>
-          <w:ilvl w:val="0"/>
-          <w:numId w:val="1"/>
-        </w:numPr>
-      </w:pPr>
-      <w:r>
-        <w:rPr>
-          <w:rFonts w:ascii="Calibri" w:cs="Calibri" w:eastAsia="Calibri" w:hAnsi="Calibri"/>
-          <w:b/>
-          <w:bCs/>
-          <w:color w:val="333333"/>
-          <w:sz w:val="24"/>
-          <w:szCs w:val="24"/>
-        </w:rPr>
-        <w:t xml:space="preserve">WordAI</w:t>
-      </w:r>
-      <w:r>
-        <w:rPr>
-          <w:rFonts w:ascii="Calibri" w:cs="Calibri" w:eastAsia="Calibri" w:hAnsi="Calibri"/>
-          <w:color w:val="333333"/>
-          <w:sz w:val="24"/>
-          <w:szCs w:val="24"/>
-        </w:rPr>
-        <w:t xml:space="preserve"> – an article rewriter built for longer content rather than single sentences.</w:t>
-      </w:r>
-    </w:p>
-    <w:p>
-      <w:pPr>
-        <w:pStyle w:val="ListParagraph"/>
-        <w:numPr>
-          <w:ilvl w:val="0"/>
-          <w:numId w:val="1"/>
-        </w:numPr>
-      </w:pPr>
-      <w:r>
-        <w:rPr>
-          <w:rFonts w:ascii="Calibri" w:cs="Calibri" w:eastAsia="Calibri" w:hAnsi="Calibri"/>
-          <w:b/>
-          <w:bCs/>
-          <w:color w:val="333333"/>
-          <w:sz w:val="24"/>
-          <w:szCs w:val="24"/>
-        </w:rPr>
-        <w:t xml:space="preserve">Grammarly</w:t>
-      </w:r>
-      <w:r>
-        <w:rPr>
-          <w:rFonts w:ascii="Calibri" w:cs="Calibri" w:eastAsia="Calibri" w:hAnsi="Calibri"/>
-          <w:color w:val="333333"/>
-          <w:sz w:val="24"/>
-          <w:szCs w:val="24"/>
-        </w:rPr>
-        <w:t xml:space="preserve"> – offers rewrite suggestions for clarity and tone inside your existing draft.</w:t>
-      </w:r>
-    </w:p>
-    <w:p>
-      <w:pPr>
-        <w:pStyle w:val="ListParagraph"/>
-        <w:numPr>
-          <w:ilvl w:val="0"/>
-          <w:numId w:val="1"/>
-        </w:numPr>
-      </w:pPr>
-      <w:r>
-        <w:rPr>
-          <w:rFonts w:ascii="Calibri" w:cs="Calibri" w:eastAsia="Calibri" w:hAnsi="Calibri"/>
-          <w:b/>
-          <w:bCs/>
-          <w:color w:val="333333"/>
-          <w:sz w:val="24"/>
-          <w:szCs w:val="24"/>
-        </w:rPr>
-        <w:t xml:space="preserve">Jasper and Copy.ai</w:t>
-      </w:r>
-      <w:r>
-        <w:rPr>
-          <w:rFonts w:ascii="Calibri" w:cs="Calibri" w:eastAsia="Calibri" w:hAnsi="Calibri"/>
-          <w:color w:val="333333"/>
-          <w:sz w:val="24"/>
-          <w:szCs w:val="24"/>
-        </w:rPr>
-        <w:t xml:space="preserve"> – marketing writing platforms that include rewriting tools for ad and web copy.</w:t>
-      </w:r>
-    </w:p>
-    <w:p>
-      <w:pPr>
-        <w:pStyle w:val="ListParagraph"/>
-        <w:numPr>
-          <w:ilvl w:val="0"/>
-          <w:numId w:val="1"/>
-        </w:numPr>
-      </w:pPr>
-      <w:r>
-        <w:rPr>
-          <w:rFonts w:ascii="Calibri" w:cs="Calibri" w:eastAsia="Calibri" w:hAnsi="Calibri"/>
-          <w:b/>
-          <w:bCs/>
-          <w:color w:val="333333"/>
-          <w:sz w:val="24"/>
-          <w:szCs w:val="24"/>
-        </w:rPr>
-        <w:t xml:space="preserve">Claude and ChatGPT</w:t>
-      </w:r>
-      <w:r>
-        <w:rPr>
-          <w:rFonts w:ascii="Calibri" w:cs="Calibri" w:eastAsia="Calibri" w:hAnsi="Calibri"/>
-          <w:color w:val="333333"/>
-          <w:sz w:val="24"/>
-          <w:szCs w:val="24"/>
-        </w:rPr>
-        <w:t xml:space="preserve"> – the most flexible for true rewriting, because you can give them a brief. I compared them in </w:t>
-      </w:r>
-      <w:hyperlink w:history="1" r:id="rId6quv4tmjdd_oyez_xnczr">
-        <w:r>
-          <w:rPr>
-            <w:rStyle w:val="Hyperlink"/>
-            <w:rFonts w:ascii="Calibri" w:cs="Calibri" w:eastAsia="Calibri" w:hAnsi="Calibri"/>
-            <w:color w:val="0563C1"/>
-            <w:sz w:val="24"/>
-            <w:szCs w:val="24"/>
-            <w:u w:val="single"/>
-          </w:rPr>
-          <w:t xml:space="preserve">best AI blog writing tools</w:t>
-        </w:r>
-      </w:hyperlink>
-      <w:r>
-        <w:rPr>
-          <w:rFonts w:ascii="Calibri" w:cs="Calibri" w:eastAsia="Calibri" w:hAnsi="Calibri"/>
-          <w:color w:val="333333"/>
-          <w:sz w:val="24"/>
-          <w:szCs w:val="24"/>
-        </w:rPr>
-        <w:t xml:space="preserve">.</w:t>
-      </w:r>
-    </w:p>
-    <w:p>
-      <w:pPr>
-        <w:spacing w:after="160"/>
-      </w:pPr>
-      <w:r>
-        <w:rPr>
-          <w:rFonts w:ascii="Calibri" w:cs="Calibri" w:eastAsia="Calibri" w:hAnsi="Calibri"/>
-          <w:color w:val="333333"/>
-          <w:sz w:val="24"/>
-          <w:szCs w:val="24"/>
-        </w:rPr>
-        <w:t xml:space="preserve">For quick, private paraphrasing in the browser, try the </w:t>
-      </w:r>
-      <w:hyperlink w:history="1" r:id="rIdrbhda3iv0qq60q9h_svs8">
-        <w:r>
-          <w:rPr>
-            <w:rStyle w:val="Hyperlink"/>
-            <w:rFonts w:ascii="Calibri" w:cs="Calibri" w:eastAsia="Calibri" w:hAnsi="Calibri"/>
-            <w:color w:val="0563C1"/>
-            <w:sz w:val="24"/>
-            <w:szCs w:val="24"/>
-            <w:u w:val="single"/>
-          </w:rPr>
-          <w:t xml:space="preserve">BrightlyFuture AI Paraphraser</w:t>
-        </w:r>
-      </w:hyperlink>
-      <w:r>
-        <w:rPr>
-          <w:rFonts w:ascii="Calibri" w:cs="Calibri" w:eastAsia="Calibri" w:hAnsi="Calibri"/>
-          <w:color w:val="333333"/>
-          <w:sz w:val="24"/>
-          <w:szCs w:val="24"/>
-        </w:rPr>
-        <w:t xml:space="preserve">. Whatever you use, run the result through the </w:t>
-      </w:r>
-      <w:hyperlink w:history="1" r:id="rId_ot5vyosdzhrqtk89hur5">
-        <w:r>
-          <w:rPr>
-            <w:rStyle w:val="Hyperlink"/>
-            <w:rFonts w:ascii="Calibri" w:cs="Calibri" w:eastAsia="Calibri" w:hAnsi="Calibri"/>
-            <w:color w:val="0563C1"/>
-            <w:sz w:val="24"/>
-            <w:szCs w:val="24"/>
-            <w:u w:val="single"/>
-          </w:rPr>
-          <w:t xml:space="preserve">readability checker</w:t>
-        </w:r>
-      </w:hyperlink>
-      <w:r>
-        <w:rPr>
-          <w:rFonts w:ascii="Calibri" w:cs="Calibri" w:eastAsia="Calibri" w:hAnsi="Calibri"/>
-          <w:color w:val="333333"/>
-          <w:sz w:val="24"/>
-          <w:szCs w:val="24"/>
-        </w:rPr>
-        <w:t xml:space="preserve"> afterwards; many paraphrasers swap short words for longer ones and make text harder to read.</w:t>
+        <w:t xml:space="preserve">When should you paraphrase and when should you rewrite?</w:t>
+      </w:r>
+    </w:p>
+    <w:p>
+      <w:pPr>
+        <w:spacing w:after="160"/>
+      </w:pPr>
+      <w:r>
+        <w:rPr>
+          <w:rFonts w:ascii="Calibri" w:cs="Calibri" w:eastAsia="Calibri" w:hAnsi="Calibri"/>
+          <w:color w:val="333333"/>
+          <w:sz w:val="24"/>
+          <w:szCs w:val="24"/>
+        </w:rPr>
+        <w:t xml:space="preserve">Paraphrase when the structure already works and only the wording needs to change. Rewrite when the piece itself needs a new shape, audience or purpose.</w:t>
       </w:r>
     </w:p>
     <w:p>
@@ -1969,6 +1314,107 @@
     </w:p>
     <w:p>
       <w:pPr>
+        <w:pStyle w:val="ListParagraph"/>
+        <w:numPr>
+          <w:ilvl w:val="0"/>
+          <w:numId w:val="1"/>
+        </w:numPr>
+      </w:pPr>
+      <w:r>
+        <w:rPr>
+          <w:rFonts w:ascii="Calibri" w:cs="Calibri" w:eastAsia="Calibri" w:hAnsi="Calibri"/>
+          <w:b/>
+          <w:bCs/>
+          <w:color w:val="333333"/>
+          <w:sz w:val="24"/>
+          <w:szCs w:val="24"/>
+        </w:rPr>
+        <w:t xml:space="preserve">Paraphrase</w:t>
+      </w:r>
+      <w:r>
+        <w:rPr>
+          <w:rFonts w:ascii="Calibri" w:cs="Calibri" w:eastAsia="Calibri" w:hAnsi="Calibri"/>
+          <w:color w:val="333333"/>
+          <w:sz w:val="24"/>
+          <w:szCs w:val="24"/>
+        </w:rPr>
+        <w:t xml:space="preserve"> to bring a source's idea into your post in your own words, to make one unclear or wordy passage plainer, or when the meaning must stay exactly the same.</w:t>
+      </w:r>
+    </w:p>
+    <w:p>
+      <w:pPr>
+        <w:pStyle w:val="ListParagraph"/>
+        <w:numPr>
+          <w:ilvl w:val="0"/>
+          <w:numId w:val="1"/>
+        </w:numPr>
+      </w:pPr>
+      <w:r>
+        <w:rPr>
+          <w:rFonts w:ascii="Calibri" w:cs="Calibri" w:eastAsia="Calibri" w:hAnsi="Calibri"/>
+          <w:b/>
+          <w:bCs/>
+          <w:color w:val="333333"/>
+          <w:sz w:val="24"/>
+          <w:szCs w:val="24"/>
+        </w:rPr>
+        <w:t xml:space="preserve">Rewrite</w:t>
+      </w:r>
+      <w:r>
+        <w:rPr>
+          <w:rFonts w:ascii="Calibri" w:cs="Calibri" w:eastAsia="Calibri" w:hAnsi="Calibri"/>
+          <w:color w:val="333333"/>
+          <w:sz w:val="24"/>
+          <w:szCs w:val="24"/>
+        </w:rPr>
+        <w:t xml:space="preserve"> to refresh an old post, to adapt a piece for a new audience or channel, or to turn a generic AI draft into something with your voice and examples.</w:t>
+      </w:r>
+    </w:p>
+    <w:p>
+      <w:pPr>
+        <w:pStyle w:val="ListParagraph"/>
+        <w:numPr>
+          <w:ilvl w:val="0"/>
+          <w:numId w:val="1"/>
+        </w:numPr>
+      </w:pPr>
+      <w:r>
+        <w:rPr>
+          <w:rFonts w:ascii="Calibri" w:cs="Calibri" w:eastAsia="Calibri" w:hAnsi="Calibri"/>
+          <w:b/>
+          <w:bCs/>
+          <w:color w:val="333333"/>
+          <w:sz w:val="24"/>
+          <w:szCs w:val="24"/>
+        </w:rPr>
+        <w:t xml:space="preserve">Do neither</w:t>
+      </w:r>
+      <w:r>
+        <w:rPr>
+          <w:rFonts w:ascii="Calibri" w:cs="Calibri" w:eastAsia="Calibri" w:hAnsi="Calibri"/>
+          <w:color w:val="333333"/>
+          <w:sz w:val="24"/>
+          <w:szCs w:val="24"/>
+        </w:rPr>
+        <w:t xml:space="preserve"> when the only goal is to get past a plagiarism or AI checker. That is the use case Google's spam policy and Turnitin's detection now target.</w:t>
+      </w:r>
+    </w:p>
+    <w:p>
+      <w:pPr>
+        <w:spacing w:after="160"/>
+      </w:pPr>
+      <w:r>
+        <w:rPr>
+          <w:rFonts w:ascii="Calibri" w:cs="Calibri" w:eastAsia="Calibri" w:hAnsi="Calibri"/>
+          <w:color w:val="333333"/>
+          <w:sz w:val="24"/>
+          <w:szCs w:val="24"/>
+        </w:rPr>
+        <w:t xml:space="preserve">A good paraphrase takes four moves: read the passage until you can explain it without looking, write your version from memory, compare it with the original, then change any phrase that still matches and add the citation.</w:t>
+      </w:r>
+    </w:p>
+    <w:p>
+      <w:pPr>
         <w:pStyle w:val="Heading2"/>
         <w:spacing w:after="120" w:before="300"/>
       </w:pPr>
@@ -1981,131 +1427,71 @@
           <w:sz w:val="36"/>
           <w:szCs w:val="36"/>
         </w:rPr>
-        <w:t xml:space="preserve">Frequently Asked Questions</w:t>
-      </w:r>
-    </w:p>
-    <w:p>
-      <w:pPr>
-        <w:pStyle w:val="Heading3"/>
-        <w:spacing w:after="80" w:before="200"/>
-      </w:pPr>
-      <w:r>
-        <w:rPr>
-          <w:rFonts w:ascii="Calibri" w:cs="Calibri" w:eastAsia="Calibri" w:hAnsi="Calibri"/>
-          <w:b/>
-          <w:bCs/>
-          <w:color w:val="333333"/>
-          <w:sz w:val="28"/>
-          <w:szCs w:val="28"/>
-        </w:rPr>
-        <w:t xml:space="preserve">Should I paraphrase or quote a source?</w:t>
-      </w:r>
-    </w:p>
-    <w:p>
-      <w:pPr>
-        <w:spacing w:after="160"/>
-      </w:pPr>
-      <w:r>
-        <w:rPr>
-          <w:rFonts w:ascii="Calibri" w:cs="Calibri" w:eastAsia="Calibri" w:hAnsi="Calibri"/>
-          <w:color w:val="333333"/>
-          <w:sz w:val="24"/>
-          <w:szCs w:val="24"/>
-        </w:rPr>
-        <w:t xml:space="preserve">Quote when the exact wording matters: a definition, a striking line or a claim you want to show precisely. Paraphrase when only the idea matters and you can say it more simply for your readers. Most blog posts need far more paraphrasing than quoting.</w:t>
-      </w:r>
-    </w:p>
-    <w:p>
-      <w:pPr>
-        <w:pStyle w:val="Heading3"/>
-        <w:spacing w:after="80" w:before="200"/>
-      </w:pPr>
-      <w:r>
-        <w:rPr>
-          <w:rFonts w:ascii="Calibri" w:cs="Calibri" w:eastAsia="Calibri" w:hAnsi="Calibri"/>
-          <w:b/>
-          <w:bCs/>
-          <w:color w:val="333333"/>
-          <w:sz w:val="28"/>
-          <w:szCs w:val="28"/>
-        </w:rPr>
-        <w:t xml:space="preserve">How do I cite a paraphrase in a blog post?</w:t>
-      </w:r>
-    </w:p>
-    <w:p>
-      <w:pPr>
-        <w:spacing w:after="160"/>
-      </w:pPr>
-      <w:r>
-        <w:rPr>
-          <w:rFonts w:ascii="Calibri" w:cs="Calibri" w:eastAsia="Calibri" w:hAnsi="Calibri"/>
-          <w:color w:val="333333"/>
-          <w:sz w:val="24"/>
-          <w:szCs w:val="24"/>
-        </w:rPr>
-        <w:t xml:space="preserve">Name the source in the sentence and link to the original page, for example "Scribbr explains that…" with a link on the source name. Academic styles such as APA also need the author and year in brackets plus a reference list entry.</w:t>
-      </w:r>
-    </w:p>
-    <w:p>
-      <w:pPr>
-        <w:pStyle w:val="Heading3"/>
-        <w:spacing w:after="80" w:before="200"/>
-      </w:pPr>
-      <w:r>
-        <w:rPr>
-          <w:rFonts w:ascii="Calibri" w:cs="Calibri" w:eastAsia="Calibri" w:hAnsi="Calibri"/>
-          <w:b/>
-          <w:bCs/>
-          <w:color w:val="333333"/>
-          <w:sz w:val="28"/>
-          <w:szCs w:val="28"/>
-        </w:rPr>
-        <w:t xml:space="preserve">Can a paraphrasing tool change the meaning of my text?</w:t>
-      </w:r>
-    </w:p>
-    <w:p>
-      <w:pPr>
-        <w:spacing w:after="160"/>
-      </w:pPr>
-      <w:r>
-        <w:rPr>
-          <w:rFonts w:ascii="Calibri" w:cs="Calibri" w:eastAsia="Calibri" w:hAnsi="Calibri"/>
-          <w:color w:val="333333"/>
-          <w:sz w:val="24"/>
-          <w:szCs w:val="24"/>
-        </w:rPr>
-        <w:t xml:space="preserve">Yes. Word-swap tools pick a synonym without reading the sentence, so "the state of the market" can become "the declare of the market", and "not" or a number can get lost in AI rewrites. Check negatives, figures and technical terms line by line before you publish.</w:t>
-      </w:r>
-    </w:p>
-    <w:p>
-      <w:pPr>
-        <w:pStyle w:val="Heading3"/>
-        <w:spacing w:after="80" w:before="200"/>
-      </w:pPr>
-      <w:r>
-        <w:rPr>
-          <w:rFonts w:ascii="Calibri" w:cs="Calibri" w:eastAsia="Calibri" w:hAnsi="Calibri"/>
-          <w:b/>
-          <w:bCs/>
-          <w:color w:val="333333"/>
-          <w:sz w:val="28"/>
-          <w:szCs w:val="28"/>
-        </w:rPr>
-        <w:t xml:space="preserve">Is it cheating to use a paraphrasing tool at university?</w:t>
-      </w:r>
-    </w:p>
-    <w:p>
-      <w:pPr>
-        <w:spacing w:after="160"/>
-      </w:pPr>
-      <w:r>
-        <w:rPr>
-          <w:rFonts w:ascii="Calibri" w:cs="Calibri" w:eastAsia="Calibri" w:hAnsi="Calibri"/>
-          <w:color w:val="333333"/>
-          <w:sz w:val="24"/>
-          <w:szCs w:val="24"/>
-        </w:rPr>
-        <w:t xml:space="preserve">It depends on your institution's policy. Many universities allow tools for language support but treat undisclosed AI rewriting of submitted work as misconduct. Check your course rules and declare the tool if they ask.</w:t>
+        <w:t xml:space="preserve">Is paraphrasing considered plagiarism?</w:t>
+      </w:r>
+    </w:p>
+    <w:p>
+      <w:pPr>
+        <w:spacing w:after="160"/>
+      </w:pPr>
+      <w:r>
+        <w:rPr>
+          <w:rFonts w:ascii="Calibri" w:cs="Calibri" w:eastAsia="Calibri" w:hAnsi="Calibri"/>
+          <w:color w:val="333333"/>
+          <w:sz w:val="24"/>
+          <w:szCs w:val="24"/>
+        </w:rPr>
+        <w:t xml:space="preserve">Paraphrasing is not plagiarism when you credit the source and genuinely restate the idea in your own words. It becomes plagiarism when you skip the credit, or when you only swap a few words and keep the author's sentence structure.</w:t>
+      </w:r>
+    </w:p>
+    <w:p>
+      <w:pPr>
+        <w:spacing w:after="160"/>
+      </w:pPr>
+      <w:r>
+        <w:rPr>
+          <w:rFonts w:ascii="Calibri" w:cs="Calibri" w:eastAsia="Calibri" w:hAnsi="Calibri"/>
+          <w:color w:val="333333"/>
+          <w:sz w:val="24"/>
+          <w:szCs w:val="24"/>
+        </w:rPr>
+        <w:t xml:space="preserve">Scribbr's guidance on </w:t>
+      </w:r>
+      <w:hyperlink w:history="1" r:id="rIduzwaidlj4kqv-isjfnhvi">
+        <w:r>
+          <w:rPr>
+            <w:rStyle w:val="Hyperlink"/>
+            <w:rFonts w:ascii="Calibri" w:cs="Calibri" w:eastAsia="Calibri" w:hAnsi="Calibri"/>
+            <w:color w:val="0563C1"/>
+            <w:sz w:val="24"/>
+            <w:szCs w:val="24"/>
+            <w:u w:val="single"/>
+          </w:rPr>
+          <w:t xml:space="preserve">whether paraphrasing is plagiarism</w:t>
+        </w:r>
+      </w:hyperlink>
+      <w:r>
+        <w:rPr>
+          <w:rFonts w:ascii="Calibri" w:cs="Calibri" w:eastAsia="Calibri" w:hAnsi="Calibri"/>
+          <w:color w:val="333333"/>
+          <w:sz w:val="24"/>
+          <w:szCs w:val="24"/>
+        </w:rPr>
+        <w:t xml:space="preserve"> makes the same point: if your text stays too close to the original, deleting a few words or swapping in synonyms still counts as plagiarism, even with a citation. My spinner result shows why. With 83% of its 5-word phrases unchanged, a plagiarism checker would flag it as a near-copy.</w:t>
+      </w:r>
+    </w:p>
+    <w:p>
+      <w:pPr>
+        <w:spacing w:after="160"/>
+      </w:pPr>
+      <w:r>
+        <w:rPr>
+          <w:rFonts w:ascii="Calibri" w:cs="Calibri" w:eastAsia="Calibri" w:hAnsi="Calibri"/>
+          <w:color w:val="333333"/>
+          <w:sz w:val="24"/>
+          <w:szCs w:val="24"/>
+        </w:rPr>
+        <w:t xml:space="preserve">Rewriting follows the same rule. If the ideas, research or structure came from someone else, credit them. Changing every word doesn't make an idea yours.</w:t>
       </w:r>
     </w:p>
     <w:p>
@@ -2122,6 +1508,846 @@
           <w:sz w:val="36"/>
           <w:szCs w:val="36"/>
         </w:rPr>
+        <w:t xml:space="preserve">Can AI paraphrase without plagiarism?</w:t>
+      </w:r>
+    </w:p>
+    <w:p>
+      <w:pPr>
+        <w:spacing w:after="160"/>
+      </w:pPr>
+      <w:r>
+        <w:rPr>
+          <w:rFonts w:ascii="Calibri" w:cs="Calibri" w:eastAsia="Calibri" w:hAnsi="Calibri"/>
+          <w:color w:val="333333"/>
+          <w:sz w:val="24"/>
+          <w:szCs w:val="24"/>
+        </w:rPr>
+        <w:t xml:space="preserve">Yes, if the AI changes sentence structure as well as words, you check the output, and you still cite the source of the idea. The risk comes from tools that only swap synonyms, and from people using any tool to hide where a text came from.</w:t>
+      </w:r>
+    </w:p>
+    <w:p>
+      <w:pPr>
+        <w:spacing w:after="160"/>
+      </w:pPr>
+      <w:r>
+        <w:rPr>
+          <w:rFonts w:ascii="Calibri" w:cs="Calibri" w:eastAsia="Calibri" w:hAnsi="Calibri"/>
+          <w:color w:val="333333"/>
+          <w:sz w:val="24"/>
+          <w:szCs w:val="24"/>
+        </w:rPr>
+        <w:t xml:space="preserve">Two changes since 2025 matter here:</w:t>
+      </w:r>
+    </w:p>
+    <w:p>
+      <w:pPr>
+        <w:pStyle w:val="ListParagraph"/>
+        <w:numPr>
+          <w:ilvl w:val="0"/>
+          <w:numId w:val="1"/>
+        </w:numPr>
+      </w:pPr>
+      <w:r>
+        <w:rPr>
+          <w:rFonts w:ascii="Calibri" w:cs="Calibri" w:eastAsia="Calibri" w:hAnsi="Calibri"/>
+          <w:b/>
+          <w:bCs/>
+          <w:color w:val="333333"/>
+          <w:sz w:val="24"/>
+          <w:szCs w:val="24"/>
+        </w:rPr>
+        <w:t xml:space="preserve">Turnitin now looks for disguised AI text.</w:t>
+      </w:r>
+      <w:r>
+        <w:rPr>
+          <w:rFonts w:ascii="Calibri" w:cs="Calibri" w:eastAsia="Calibri" w:hAnsi="Calibri"/>
+          <w:color w:val="333333"/>
+          <w:sz w:val="24"/>
+          <w:szCs w:val="24"/>
+        </w:rPr>
+        <w:t xml:space="preserve"> On 27 August 2025, Turnitin </w:t>
+      </w:r>
+      <w:hyperlink w:history="1" r:id="rIdlzk277doxabwcrl68gso8">
+        <w:r>
+          <w:rPr>
+            <w:rStyle w:val="Hyperlink"/>
+            <w:rFonts w:ascii="Calibri" w:cs="Calibri" w:eastAsia="Calibri" w:hAnsi="Calibri"/>
+            <w:color w:val="0563C1"/>
+            <w:sz w:val="24"/>
+            <w:szCs w:val="24"/>
+            <w:u w:val="single"/>
+          </w:rPr>
+          <w:t xml:space="preserve">launched AI bypasser detection</w:t>
+        </w:r>
+      </w:hyperlink>
+      <w:r>
+        <w:rPr>
+          <w:rFonts w:ascii="Calibri" w:cs="Calibri" w:eastAsia="Calibri" w:hAnsi="Calibri"/>
+          <w:color w:val="333333"/>
+          <w:sz w:val="24"/>
+          <w:szCs w:val="24"/>
+        </w:rPr>
+        <w:t xml:space="preserve">, trained on the patterns that leading humanizer tools leave behind. Running AI text through a humanizer is no longer a reliable way to hide it.</w:t>
+      </w:r>
+    </w:p>
+    <w:p>
+      <w:pPr>
+        <w:pStyle w:val="ListParagraph"/>
+        <w:numPr>
+          <w:ilvl w:val="0"/>
+          <w:numId w:val="1"/>
+        </w:numPr>
+      </w:pPr>
+      <w:r>
+        <w:rPr>
+          <w:rFonts w:ascii="Calibri" w:cs="Calibri" w:eastAsia="Calibri" w:hAnsi="Calibri"/>
+          <w:b/>
+          <w:bCs/>
+          <w:color w:val="333333"/>
+          <w:sz w:val="24"/>
+          <w:szCs w:val="24"/>
+        </w:rPr>
+        <w:t xml:space="preserve">Google names synonym swapping as spam.</w:t>
+      </w:r>
+      <w:r>
+        <w:rPr>
+          <w:rFonts w:ascii="Calibri" w:cs="Calibri" w:eastAsia="Calibri" w:hAnsi="Calibri"/>
+          <w:color w:val="333333"/>
+          <w:sz w:val="24"/>
+          <w:szCs w:val="24"/>
+        </w:rPr>
+        <w:t xml:space="preserve"> Google's </w:t>
+      </w:r>
+      <w:hyperlink w:history="1" r:id="rId0w7zrhfwlukntjnxczpjl">
+        <w:r>
+          <w:rPr>
+            <w:rStyle w:val="Hyperlink"/>
+            <w:rFonts w:ascii="Calibri" w:cs="Calibri" w:eastAsia="Calibri" w:hAnsi="Calibri"/>
+            <w:color w:val="0563C1"/>
+            <w:sz w:val="24"/>
+            <w:szCs w:val="24"/>
+            <w:u w:val="single"/>
+          </w:rPr>
+          <w:t xml:space="preserve">spam policies</w:t>
+        </w:r>
+      </w:hyperlink>
+      <w:r>
+        <w:rPr>
+          <w:rFonts w:ascii="Calibri" w:cs="Calibri" w:eastAsia="Calibri" w:hAnsi="Calibri"/>
+          <w:color w:val="333333"/>
+          <w:sz w:val="24"/>
+          <w:szCs w:val="24"/>
+        </w:rPr>
+        <w:t xml:space="preserve">, updated in August 2026, list copying content and modifying it "only slightly (for example, by substituting synonyms or using automated techniques)" as scraping.</w:t>
+      </w:r>
+    </w:p>
+    <w:p>
+      <w:pPr>
+        <w:spacing w:after="160"/>
+      </w:pPr>
+      <w:r>
+        <w:rPr>
+          <w:rFonts w:ascii="Calibri" w:cs="Calibri" w:eastAsia="Calibri" w:hAnsi="Calibri"/>
+          <w:color w:val="333333"/>
+          <w:sz w:val="24"/>
+          <w:szCs w:val="24"/>
+        </w:rPr>
+        <w:t xml:space="preserve">The safe way to use AI for either job:</w:t>
+      </w:r>
+    </w:p>
+    <w:p>
+      <w:pPr>
+        <w:spacing w:after="160"/>
+      </w:pPr>
+      <w:r>
+        <w:rPr>
+          <w:rFonts w:ascii="Calibri" w:cs="Calibri" w:eastAsia="Calibri" w:hAnsi="Calibri"/>
+          <w:color w:val="333333"/>
+          <w:sz w:val="24"/>
+          <w:szCs w:val="24"/>
+        </w:rPr>
+        <w:t xml:space="preserve">1. Feed it your own draft or notes, not someone else's article.</w:t>
+      </w:r>
+    </w:p>
+    <w:p>
+      <w:pPr>
+        <w:spacing w:after="160"/>
+      </w:pPr>
+      <w:r>
+        <w:rPr>
+          <w:rFonts w:ascii="Calibri" w:cs="Calibri" w:eastAsia="Calibri" w:hAnsi="Calibri"/>
+          <w:color w:val="333333"/>
+          <w:sz w:val="24"/>
+          <w:szCs w:val="24"/>
+        </w:rPr>
+        <w:t xml:space="preserve">2. Tell it which one you want. "Paraphrase this paragraph, same meaning and length" and "Rewrite this section for beginners, new structure, keep these facts" produce very different results.</w:t>
+      </w:r>
+    </w:p>
+    <w:p>
+      <w:pPr>
+        <w:spacing w:after="160"/>
+      </w:pPr>
+      <w:r>
+        <w:rPr>
+          <w:rFonts w:ascii="Calibri" w:cs="Calibri" w:eastAsia="Calibri" w:hAnsi="Calibri"/>
+          <w:color w:val="333333"/>
+          <w:sz w:val="24"/>
+          <w:szCs w:val="24"/>
+        </w:rPr>
+        <w:t xml:space="preserve">3. Read the output against the original. Put back any fact it dropped or changed.</w:t>
+      </w:r>
+    </w:p>
+    <w:p>
+      <w:pPr>
+        <w:spacing w:after="160"/>
+      </w:pPr>
+      <w:r>
+        <w:rPr>
+          <w:rFonts w:ascii="Calibri" w:cs="Calibri" w:eastAsia="Calibri" w:hAnsi="Calibri"/>
+          <w:color w:val="333333"/>
+          <w:sz w:val="24"/>
+          <w:szCs w:val="24"/>
+        </w:rPr>
+        <w:t xml:space="preserve">4. Cite every source whose idea you used.</w:t>
+      </w:r>
+    </w:p>
+    <w:p>
+      <w:pPr>
+        <w:spacing w:after="160"/>
+      </w:pPr>
+      <w:r>
+        <w:rPr>
+          <w:rFonts w:ascii="Calibri" w:cs="Calibri" w:eastAsia="Calibri" w:hAnsi="Calibri"/>
+          <w:color w:val="333333"/>
+          <w:sz w:val="24"/>
+          <w:szCs w:val="24"/>
+        </w:rPr>
+        <w:t xml:space="preserve">My guide on </w:t>
+      </w:r>
+      <w:hyperlink w:history="1" r:id="rIdwlvmplqam5len8ecphfmw">
+        <w:r>
+          <w:rPr>
+            <w:rStyle w:val="Hyperlink"/>
+            <w:rFonts w:ascii="Calibri" w:cs="Calibri" w:eastAsia="Calibri" w:hAnsi="Calibri"/>
+            <w:color w:val="0563C1"/>
+            <w:sz w:val="24"/>
+            <w:szCs w:val="24"/>
+            <w:u w:val="single"/>
+          </w:rPr>
+          <w:t xml:space="preserve">how to humanize AI content</w:t>
+        </w:r>
+      </w:hyperlink>
+      <w:r>
+        <w:rPr>
+          <w:rFonts w:ascii="Calibri" w:cs="Calibri" w:eastAsia="Calibri" w:hAnsi="Calibri"/>
+          <w:color w:val="333333"/>
+          <w:sz w:val="24"/>
+          <w:szCs w:val="24"/>
+        </w:rPr>
+        <w:t xml:space="preserve"> covers step 3 in detail.</w:t>
+      </w:r>
+    </w:p>
+    <w:p>
+      <w:pPr>
+        <w:pStyle w:val="Heading2"/>
+        <w:spacing w:after="120" w:before="300"/>
+      </w:pPr>
+      <w:r>
+        <w:rPr>
+          <w:rFonts w:ascii="Calibri" w:cs="Calibri" w:eastAsia="Calibri" w:hAnsi="Calibri"/>
+          <w:b/>
+          <w:bCs/>
+          <w:color w:val="7C3AED"/>
+          <w:sz w:val="36"/>
+          <w:szCs w:val="36"/>
+        </w:rPr>
+        <w:t xml:space="preserve">Does Google penalise paraphrased or rewritten content?</w:t>
+      </w:r>
+    </w:p>
+    <w:p>
+      <w:pPr>
+        <w:spacing w:after="160"/>
+      </w:pPr>
+      <w:r>
+        <w:rPr>
+          <w:rFonts w:ascii="Calibri" w:cs="Calibri" w:eastAsia="Calibri" w:hAnsi="Calibri"/>
+          <w:color w:val="333333"/>
+          <w:sz w:val="24"/>
+          <w:szCs w:val="24"/>
+        </w:rPr>
+        <w:t xml:space="preserve">Google doesn't penalise text for being paraphrased, rewritten or AI-assisted. Its </w:t>
+      </w:r>
+      <w:hyperlink w:history="1" r:id="rIdexrfbuotowzrsu_uncfbo">
+        <w:r>
+          <w:rPr>
+            <w:rStyle w:val="Hyperlink"/>
+            <w:rFonts w:ascii="Calibri" w:cs="Calibri" w:eastAsia="Calibri" w:hAnsi="Calibri"/>
+            <w:color w:val="0563C1"/>
+            <w:sz w:val="24"/>
+            <w:szCs w:val="24"/>
+            <w:u w:val="single"/>
+          </w:rPr>
+          <w:t xml:space="preserve">February 2023 guidance on AI content</w:t>
+        </w:r>
+      </w:hyperlink>
+      <w:r>
+        <w:rPr>
+          <w:rFonts w:ascii="Calibri" w:cs="Calibri" w:eastAsia="Calibri" w:hAnsi="Calibri"/>
+          <w:color w:val="333333"/>
+          <w:sz w:val="24"/>
+          <w:szCs w:val="24"/>
+        </w:rPr>
+        <w:t xml:space="preserve"> says it rewards high-quality content however it's produced. It rates pages low when they add nothing new. The January 2025 update to Google's Search Quality Rater Guidelines gives the Lowest rating when almost all main content is "copied or paraphrased with no effort or added value", as </w:t>
+      </w:r>
+      <w:hyperlink w:history="1" r:id="rIdmd2of15dqxmsmlmk4iim6">
+        <w:r>
+          <w:rPr>
+            <w:rStyle w:val="Hyperlink"/>
+            <w:rFonts w:ascii="Calibri" w:cs="Calibri" w:eastAsia="Calibri" w:hAnsi="Calibri"/>
+            <w:color w:val="0563C1"/>
+            <w:sz w:val="24"/>
+            <w:szCs w:val="24"/>
+            <w:u w:val="single"/>
+          </w:rPr>
+          <w:t xml:space="preserve">PPC Land's summary of the update</w:t>
+        </w:r>
+      </w:hyperlink>
+      <w:r>
+        <w:rPr>
+          <w:rFonts w:ascii="Calibri" w:cs="Calibri" w:eastAsia="Calibri" w:hAnsi="Calibri"/>
+          <w:color w:val="333333"/>
+          <w:sz w:val="24"/>
+          <w:szCs w:val="24"/>
+        </w:rPr>
+        <w:t xml:space="preserve"> quotes.</w:t>
+      </w:r>
+    </w:p>
+    <w:p>
+      <w:pPr>
+        <w:spacing w:after="160"/>
+      </w:pPr>
+      <w:r>
+        <w:rPr>
+          <w:rFonts w:ascii="Calibri" w:cs="Calibri" w:eastAsia="Calibri" w:hAnsi="Calibri"/>
+          <w:color w:val="333333"/>
+          <w:sz w:val="24"/>
+          <w:szCs w:val="24"/>
+        </w:rPr>
+        <w:t xml:space="preserve">So the question isn't "paraphrase or rewrite?" It's "what did I add?" For a blog, that usually means a rewrite plus something the source didn't have: your test, your data, your example.</w:t>
+      </w:r>
+    </w:p>
+    <w:p>
+      <w:pPr>
+        <w:pStyle w:val="Heading2"/>
+        <w:spacing w:after="120" w:before="300"/>
+      </w:pPr>
+      <w:r>
+        <w:rPr>
+          <w:rFonts w:ascii="Calibri" w:cs="Calibri" w:eastAsia="Calibri" w:hAnsi="Calibri"/>
+          <w:b/>
+          <w:bCs/>
+          <w:color w:val="7C3AED"/>
+          <w:sz w:val="36"/>
+          <w:szCs w:val="36"/>
+        </w:rPr>
+        <w:t xml:space="preserve">Which AI tool is best for paraphrasing vs rewriting?</w:t>
+      </w:r>
+    </w:p>
+    <w:p>
+      <w:pPr>
+        <w:spacing w:after="160"/>
+      </w:pPr>
+      <w:r>
+        <w:rPr>
+          <w:rFonts w:ascii="Calibri" w:cs="Calibri" w:eastAsia="Calibri" w:hAnsi="Calibri"/>
+          <w:color w:val="333333"/>
+          <w:sz w:val="24"/>
+          <w:szCs w:val="24"/>
+        </w:rPr>
+        <w:t xml:space="preserve">The best tool depends on the job. Sentence-level paraphrasers suit short passages. Chat-based AI suits full rewrites because you can tell it the audience, structure and facts to keep.</w:t>
+      </w:r>
+    </w:p>
+    <w:p>
+      <w:pPr>
+        <w:pStyle w:val="ListParagraph"/>
+        <w:numPr>
+          <w:ilvl w:val="0"/>
+          <w:numId w:val="1"/>
+        </w:numPr>
+      </w:pPr>
+      <w:r>
+        <w:rPr>
+          <w:rFonts w:ascii="Calibri" w:cs="Calibri" w:eastAsia="Calibri" w:hAnsi="Calibri"/>
+          <w:b/>
+          <w:bCs/>
+          <w:color w:val="333333"/>
+          <w:sz w:val="24"/>
+          <w:szCs w:val="24"/>
+        </w:rPr>
+        <w:t xml:space="preserve">QuillBot</w:t>
+      </w:r>
+      <w:r>
+        <w:rPr>
+          <w:rFonts w:ascii="Calibri" w:cs="Calibri" w:eastAsia="Calibri" w:hAnsi="Calibri"/>
+          <w:color w:val="333333"/>
+          <w:sz w:val="24"/>
+          <w:szCs w:val="24"/>
+        </w:rPr>
+        <w:t xml:space="preserve"> – the best-known paraphraser. The free plan handles 125 words at a time with the Standard and Fluency modes; Premium unlocks the other modes and removes the limit.</w:t>
+      </w:r>
+    </w:p>
+    <w:p>
+      <w:pPr>
+        <w:pStyle w:val="ListParagraph"/>
+        <w:numPr>
+          <w:ilvl w:val="0"/>
+          <w:numId w:val="1"/>
+        </w:numPr>
+      </w:pPr>
+      <w:r>
+        <w:rPr>
+          <w:rFonts w:ascii="Calibri" w:cs="Calibri" w:eastAsia="Calibri" w:hAnsi="Calibri"/>
+          <w:b/>
+          <w:bCs/>
+          <w:color w:val="333333"/>
+          <w:sz w:val="24"/>
+          <w:szCs w:val="24"/>
+        </w:rPr>
+        <w:t xml:space="preserve">Spinbot and other synonym spinners</w:t>
+      </w:r>
+      <w:r>
+        <w:rPr>
+          <w:rFonts w:ascii="Calibri" w:cs="Calibri" w:eastAsia="Calibri" w:hAnsi="Calibri"/>
+          <w:color w:val="333333"/>
+          <w:sz w:val="24"/>
+          <w:szCs w:val="24"/>
+        </w:rPr>
+        <w:t xml:space="preserve"> – swap words at speed. Fine for brainstorming alternative phrasings, risky for anything you publish, for the reasons my test showed.</w:t>
+      </w:r>
+    </w:p>
+    <w:p>
+      <w:pPr>
+        <w:pStyle w:val="ListParagraph"/>
+        <w:numPr>
+          <w:ilvl w:val="0"/>
+          <w:numId w:val="1"/>
+        </w:numPr>
+      </w:pPr>
+      <w:r>
+        <w:rPr>
+          <w:rFonts w:ascii="Calibri" w:cs="Calibri" w:eastAsia="Calibri" w:hAnsi="Calibri"/>
+          <w:b/>
+          <w:bCs/>
+          <w:color w:val="333333"/>
+          <w:sz w:val="24"/>
+          <w:szCs w:val="24"/>
+        </w:rPr>
+        <w:t xml:space="preserve">WordAI</w:t>
+      </w:r>
+      <w:r>
+        <w:rPr>
+          <w:rFonts w:ascii="Calibri" w:cs="Calibri" w:eastAsia="Calibri" w:hAnsi="Calibri"/>
+          <w:color w:val="333333"/>
+          <w:sz w:val="24"/>
+          <w:szCs w:val="24"/>
+        </w:rPr>
+        <w:t xml:space="preserve"> – an article rewriter built for longer content rather than single sentences.</w:t>
+      </w:r>
+    </w:p>
+    <w:p>
+      <w:pPr>
+        <w:pStyle w:val="ListParagraph"/>
+        <w:numPr>
+          <w:ilvl w:val="0"/>
+          <w:numId w:val="1"/>
+        </w:numPr>
+      </w:pPr>
+      <w:r>
+        <w:rPr>
+          <w:rFonts w:ascii="Calibri" w:cs="Calibri" w:eastAsia="Calibri" w:hAnsi="Calibri"/>
+          <w:b/>
+          <w:bCs/>
+          <w:color w:val="333333"/>
+          <w:sz w:val="24"/>
+          <w:szCs w:val="24"/>
+        </w:rPr>
+        <w:t xml:space="preserve">Grammarly</w:t>
+      </w:r>
+      <w:r>
+        <w:rPr>
+          <w:rFonts w:ascii="Calibri" w:cs="Calibri" w:eastAsia="Calibri" w:hAnsi="Calibri"/>
+          <w:color w:val="333333"/>
+          <w:sz w:val="24"/>
+          <w:szCs w:val="24"/>
+        </w:rPr>
+        <w:t xml:space="preserve"> – offers rewrite suggestions for clarity and tone inside your existing draft.</w:t>
+      </w:r>
+    </w:p>
+    <w:p>
+      <w:pPr>
+        <w:pStyle w:val="ListParagraph"/>
+        <w:numPr>
+          <w:ilvl w:val="0"/>
+          <w:numId w:val="1"/>
+        </w:numPr>
+      </w:pPr>
+      <w:r>
+        <w:rPr>
+          <w:rFonts w:ascii="Calibri" w:cs="Calibri" w:eastAsia="Calibri" w:hAnsi="Calibri"/>
+          <w:b/>
+          <w:bCs/>
+          <w:color w:val="333333"/>
+          <w:sz w:val="24"/>
+          <w:szCs w:val="24"/>
+        </w:rPr>
+        <w:t xml:space="preserve">Jasper and Copy.ai</w:t>
+      </w:r>
+      <w:r>
+        <w:rPr>
+          <w:rFonts w:ascii="Calibri" w:cs="Calibri" w:eastAsia="Calibri" w:hAnsi="Calibri"/>
+          <w:color w:val="333333"/>
+          <w:sz w:val="24"/>
+          <w:szCs w:val="24"/>
+        </w:rPr>
+        <w:t xml:space="preserve"> – marketing writing platforms that include rewriting tools for ad and web copy.</w:t>
+      </w:r>
+    </w:p>
+    <w:p>
+      <w:pPr>
+        <w:pStyle w:val="ListParagraph"/>
+        <w:numPr>
+          <w:ilvl w:val="0"/>
+          <w:numId w:val="1"/>
+        </w:numPr>
+      </w:pPr>
+      <w:r>
+        <w:rPr>
+          <w:rFonts w:ascii="Calibri" w:cs="Calibri" w:eastAsia="Calibri" w:hAnsi="Calibri"/>
+          <w:b/>
+          <w:bCs/>
+          <w:color w:val="333333"/>
+          <w:sz w:val="24"/>
+          <w:szCs w:val="24"/>
+        </w:rPr>
+        <w:t xml:space="preserve">Claude and ChatGPT</w:t>
+      </w:r>
+      <w:r>
+        <w:rPr>
+          <w:rFonts w:ascii="Calibri" w:cs="Calibri" w:eastAsia="Calibri" w:hAnsi="Calibri"/>
+          <w:color w:val="333333"/>
+          <w:sz w:val="24"/>
+          <w:szCs w:val="24"/>
+        </w:rPr>
+        <w:t xml:space="preserve"> – the most flexible for true rewriting, because you can give them a brief. I compared them in </w:t>
+      </w:r>
+      <w:hyperlink w:history="1" r:id="rIdgl2c30eezbr8foimuc9dn">
+        <w:r>
+          <w:rPr>
+            <w:rStyle w:val="Hyperlink"/>
+            <w:rFonts w:ascii="Calibri" w:cs="Calibri" w:eastAsia="Calibri" w:hAnsi="Calibri"/>
+            <w:color w:val="0563C1"/>
+            <w:sz w:val="24"/>
+            <w:szCs w:val="24"/>
+            <w:u w:val="single"/>
+          </w:rPr>
+          <w:t xml:space="preserve">best AI blog writing tools</w:t>
+        </w:r>
+      </w:hyperlink>
+      <w:r>
+        <w:rPr>
+          <w:rFonts w:ascii="Calibri" w:cs="Calibri" w:eastAsia="Calibri" w:hAnsi="Calibri"/>
+          <w:color w:val="333333"/>
+          <w:sz w:val="24"/>
+          <w:szCs w:val="24"/>
+        </w:rPr>
+        <w:t xml:space="preserve">.</w:t>
+      </w:r>
+    </w:p>
+    <w:p>
+      <w:pPr>
+        <w:spacing w:after="160"/>
+      </w:pPr>
+      <w:r>
+        <w:rPr>
+          <w:rFonts w:ascii="Calibri" w:cs="Calibri" w:eastAsia="Calibri" w:hAnsi="Calibri"/>
+          <w:color w:val="333333"/>
+          <w:sz w:val="24"/>
+          <w:szCs w:val="24"/>
+        </w:rPr>
+        <w:t xml:space="preserve">After my test, I rebuilt our own </w:t>
+      </w:r>
+      <w:hyperlink w:history="1" r:id="rIdjjjxftvm_ysz17iqrn5wr">
+        <w:r>
+          <w:rPr>
+            <w:rStyle w:val="Hyperlink"/>
+            <w:rFonts w:ascii="Calibri" w:cs="Calibri" w:eastAsia="Calibri" w:hAnsi="Calibri"/>
+            <w:color w:val="0563C1"/>
+            <w:sz w:val="24"/>
+            <w:szCs w:val="24"/>
+            <w:u w:val="single"/>
+          </w:rPr>
+          <w:t xml:space="preserve">free paraphraser</w:t>
+        </w:r>
+      </w:hyperlink>
+      <w:r>
+        <w:rPr>
+          <w:rFonts w:ascii="Calibri" w:cs="Calibri" w:eastAsia="Calibri" w:hAnsi="Calibri"/>
+          <w:color w:val="333333"/>
+          <w:sz w:val="24"/>
+          <w:szCs w:val="24"/>
+        </w:rPr>
+        <w:t xml:space="preserve"> so it does more than swap words. It rewrites common wordy phrases, moves clauses, splits long sentences and runs entirely in your browser. It also shows a "Phrases kept" score: the share of 5-word phrases still matching your original, the same measure I used above. On my test paragraph, Standard mode kept about a fifth of them on average and Creative mode under a tenth, down from 83% for a basic spinner.</w:t>
+      </w:r>
+    </w:p>
+    <w:p>
+      <w:r>
+        <w:rPr>
+          <w:rFonts w:ascii="Calibri" w:cs="Calibri" w:eastAsia="Calibri" w:hAnsi="Calibri"/>
+          <w:i/>
+          <w:iCs/>
+          <w:color w:val="7C3AED"/>
+          <w:sz w:val="20"/>
+          <w:szCs w:val="20"/>
+        </w:rPr>
+        <w:t xml:space="preserve">[Image: 06-paraphrasing-tool-phrases-kept.webp] Alt: Screenshot: the BrightlyFuture paraphraser showing words changed and the Phrases kept score</w:t>
+      </w:r>
+    </w:p>
+    <w:p>
+      <w:pPr>
+        <w:spacing w:after="200"/>
+      </w:pPr>
+      <w:r>
+        <w:drawing>
+          <wp:inline distT="0" distB="0" distL="0" distR="0">
+            <wp:extent cx="5715000" cy="3810000"/>
+            <wp:effectExtent t="0" r="0" b="0" l="0"/>
+            <wp:docPr id="1" name="" descr="" title=""/>
+            <wp:cNvGraphicFramePr>
+              <a:graphicFrameLocks xmlns:a="http://schemas.openxmlformats.org/drawingml/2006/main" noChangeAspect="1"/>
+            </wp:cNvGraphicFramePr>
+            <a:graphic xmlns:a="http://schemas.openxmlformats.org/drawingml/2006/main">
+              <a:graphicData uri="http://schemas.openxmlformats.org/drawingml/2006/picture">
+                <pic:pic xmlns:pic="http://schemas.openxmlformats.org/drawingml/2006/picture">
+                  <pic:nvPicPr>
+                    <pic:cNvPr id="0" name="" descr=""/>
+                    <pic:cNvPicPr>
+                      <a:picLocks noChangeAspect="1" noChangeArrowheads="1"/>
+                    </pic:cNvPicPr>
+                  </pic:nvPicPr>
+                  <pic:blipFill>
+                    <a:blip r:embed="rId12" cstate="none"/>
+                    <a:srcRect/>
+                    <a:stretch>
+                      <a:fillRect/>
+                    </a:stretch>
+                  </pic:blipFill>
+                  <pic:spPr bwMode="auto">
+                    <a:xfrm>
+                      <a:off x="0" y="0"/>
+                      <a:ext cx="5715000" cy="3810000"/>
+                    </a:xfrm>
+                    <a:prstGeom prst="rect">
+                      <a:avLst/>
+                    </a:prstGeom>
+                  </pic:spPr>
+                </pic:pic>
+              </a:graphicData>
+            </a:graphic>
+          </wp:inline>
+        </w:drawing>
+      </w:r>
+    </w:p>
+    <w:p>
+      <w:pPr>
+        <w:spacing w:after="160"/>
+      </w:pPr>
+      <w:r>
+        <w:rPr>
+          <w:rFonts w:ascii="Calibri" w:cs="Calibri" w:eastAsia="Calibri" w:hAnsi="Calibri"/>
+          <w:color w:val="333333"/>
+          <w:sz w:val="24"/>
+          <w:szCs w:val="24"/>
+        </w:rPr>
+        <w:t xml:space="preserve">Whatever you use, run the result through the </w:t>
+      </w:r>
+      <w:hyperlink w:history="1" r:id="rIdghvucvhxxccny_8edyia3">
+        <w:r>
+          <w:rPr>
+            <w:rStyle w:val="Hyperlink"/>
+            <w:rFonts w:ascii="Calibri" w:cs="Calibri" w:eastAsia="Calibri" w:hAnsi="Calibri"/>
+            <w:color w:val="0563C1"/>
+            <w:sz w:val="24"/>
+            <w:szCs w:val="24"/>
+            <w:u w:val="single"/>
+          </w:rPr>
+          <w:t xml:space="preserve">readability checker</w:t>
+        </w:r>
+      </w:hyperlink>
+      <w:r>
+        <w:rPr>
+          <w:rFonts w:ascii="Calibri" w:cs="Calibri" w:eastAsia="Calibri" w:hAnsi="Calibri"/>
+          <w:color w:val="333333"/>
+          <w:sz w:val="24"/>
+          <w:szCs w:val="24"/>
+        </w:rPr>
+        <w:t xml:space="preserve"> afterwards. Many paraphrasers swap short words for longer ones and make text harder to read.</w:t>
+      </w:r>
+    </w:p>
+    <w:p>
+      <w:pPr>
+        <w:pStyle w:val="Heading2"/>
+        <w:spacing w:after="120" w:before="300"/>
+      </w:pPr>
+      <w:r>
+        <w:rPr>
+          <w:rFonts w:ascii="Calibri" w:cs="Calibri" w:eastAsia="Calibri" w:hAnsi="Calibri"/>
+          <w:b/>
+          <w:bCs/>
+          <w:color w:val="7C3AED"/>
+          <w:sz w:val="36"/>
+          <w:szCs w:val="36"/>
+        </w:rPr>
+        <w:t xml:space="preserve">Frequently Asked Questions</w:t>
+      </w:r>
+    </w:p>
+    <w:p>
+      <w:pPr>
+        <w:pStyle w:val="Heading3"/>
+        <w:spacing w:after="80" w:before="200"/>
+      </w:pPr>
+      <w:r>
+        <w:rPr>
+          <w:rFonts w:ascii="Calibri" w:cs="Calibri" w:eastAsia="Calibri" w:hAnsi="Calibri"/>
+          <w:b/>
+          <w:bCs/>
+          <w:color w:val="333333"/>
+          <w:sz w:val="28"/>
+          <w:szCs w:val="28"/>
+        </w:rPr>
+        <w:t xml:space="preserve">Should I paraphrase or quote a source?</w:t>
+      </w:r>
+    </w:p>
+    <w:p>
+      <w:pPr>
+        <w:spacing w:after="160"/>
+      </w:pPr>
+      <w:r>
+        <w:rPr>
+          <w:rFonts w:ascii="Calibri" w:cs="Calibri" w:eastAsia="Calibri" w:hAnsi="Calibri"/>
+          <w:color w:val="333333"/>
+          <w:sz w:val="24"/>
+          <w:szCs w:val="24"/>
+        </w:rPr>
+        <w:t xml:space="preserve">Quote when the exact wording matters: a definition, a striking line or a claim you want to show precisely. Paraphrase when only the idea matters and you can say it more simply for your readers. Most blog posts need far more paraphrasing than quoting.</w:t>
+      </w:r>
+    </w:p>
+    <w:p>
+      <w:pPr>
+        <w:pStyle w:val="Heading3"/>
+        <w:spacing w:after="80" w:before="200"/>
+      </w:pPr>
+      <w:r>
+        <w:rPr>
+          <w:rFonts w:ascii="Calibri" w:cs="Calibri" w:eastAsia="Calibri" w:hAnsi="Calibri"/>
+          <w:b/>
+          <w:bCs/>
+          <w:color w:val="333333"/>
+          <w:sz w:val="28"/>
+          <w:szCs w:val="28"/>
+        </w:rPr>
+        <w:t xml:space="preserve">How do I cite a paraphrase in a blog post?</w:t>
+      </w:r>
+    </w:p>
+    <w:p>
+      <w:pPr>
+        <w:spacing w:after="160"/>
+      </w:pPr>
+      <w:r>
+        <w:rPr>
+          <w:rFonts w:ascii="Calibri" w:cs="Calibri" w:eastAsia="Calibri" w:hAnsi="Calibri"/>
+          <w:color w:val="333333"/>
+          <w:sz w:val="24"/>
+          <w:szCs w:val="24"/>
+        </w:rPr>
+        <w:t xml:space="preserve">Name the source in the sentence and link to the original page, for example "Scribbr explains that…" with a link on the source name. Academic styles such as APA also need the author and year in brackets plus a reference list entry.</w:t>
+      </w:r>
+    </w:p>
+    <w:p>
+      <w:pPr>
+        <w:pStyle w:val="Heading3"/>
+        <w:spacing w:after="80" w:before="200"/>
+      </w:pPr>
+      <w:r>
+        <w:rPr>
+          <w:rFonts w:ascii="Calibri" w:cs="Calibri" w:eastAsia="Calibri" w:hAnsi="Calibri"/>
+          <w:b/>
+          <w:bCs/>
+          <w:color w:val="333333"/>
+          <w:sz w:val="28"/>
+          <w:szCs w:val="28"/>
+        </w:rPr>
+        <w:t xml:space="preserve">Can I paraphrase my own old blog post and publish it again?</w:t>
+      </w:r>
+    </w:p>
+    <w:p>
+      <w:pPr>
+        <w:spacing w:after="160"/>
+      </w:pPr>
+      <w:r>
+        <w:rPr>
+          <w:rFonts w:ascii="Calibri" w:cs="Calibri" w:eastAsia="Calibri" w:hAnsi="Calibri"/>
+          <w:color w:val="333333"/>
+          <w:sz w:val="24"/>
+          <w:szCs w:val="24"/>
+        </w:rPr>
+        <w:t xml:space="preserve">You can, but you rarely should. Two near-identical posts on the same site compete for the same searches. Update the original URL instead, or if you do publish a new version, 301-redirect the old one to it.</w:t>
+      </w:r>
+    </w:p>
+    <w:p>
+      <w:pPr>
+        <w:pStyle w:val="Heading3"/>
+        <w:spacing w:after="80" w:before="200"/>
+      </w:pPr>
+      <w:r>
+        <w:rPr>
+          <w:rFonts w:ascii="Calibri" w:cs="Calibri" w:eastAsia="Calibri" w:hAnsi="Calibri"/>
+          <w:b/>
+          <w:bCs/>
+          <w:color w:val="333333"/>
+          <w:sz w:val="28"/>
+          <w:szCs w:val="28"/>
+        </w:rPr>
+        <w:t xml:space="preserve">Is it cheating to use a paraphrasing tool at university?</w:t>
+      </w:r>
+    </w:p>
+    <w:p>
+      <w:pPr>
+        <w:spacing w:after="160"/>
+      </w:pPr>
+      <w:r>
+        <w:rPr>
+          <w:rFonts w:ascii="Calibri" w:cs="Calibri" w:eastAsia="Calibri" w:hAnsi="Calibri"/>
+          <w:color w:val="333333"/>
+          <w:sz w:val="24"/>
+          <w:szCs w:val="24"/>
+        </w:rPr>
+        <w:t xml:space="preserve">It depends on your institution's policy. Many universities allow tools for language support but treat undisclosed AI rewriting of submitted work as misconduct. Check your course rules and declare the tool if they ask.</w:t>
+      </w:r>
+    </w:p>
+    <w:p>
+      <w:pPr>
+        <w:pStyle w:val="Heading2"/>
+        <w:spacing w:after="120" w:before="300"/>
+      </w:pPr>
+      <w:r>
+        <w:rPr>
+          <w:rFonts w:ascii="Calibri" w:cs="Calibri" w:eastAsia="Calibri" w:hAnsi="Calibri"/>
+          <w:b/>
+          <w:bCs/>
+          <w:color w:val="7C3AED"/>
+          <w:sz w:val="36"/>
+          <w:szCs w:val="36"/>
+        </w:rPr>
         <w:t xml:space="preserve">Final thoughts</w:t>
       </w:r>
     </w:p>
@@ -2152,7 +2378,7 @@
         </w:rPr>
         <w:t xml:space="preserve">For the full process from draft to publish, see the </w:t>
       </w:r>
-      <w:hyperlink w:history="1" r:id="rIdt_2omslk6nqlm6x2me0tj">
+      <w:hyperlink w:history="1" r:id="rIdqb0bjp6rvlkzfe877-3ce">
         <w:r>
           <w:rPr>
             <w:rStyle w:val="Hyperlink"/>

</xml_diff>

<commit_message>
Cite current (Sept 2025) Google Quality Rater Guidelines PDF in paraphrasing article
Co-Authored-By: Claude Opus 5.5 <noreply@anthropic.com>
Claude-Session: https://claude.ai/code/session_01GQXcnZLn4f9MkUS7SEqp5J
</commit_message>
<xml_diff>
--- a/blog-content/AI-Paraphrasing-vs-Rewriting.docx
+++ b/blog-content/AI-Paraphrasing-vs-Rewriting.docx
@@ -622,7 +622,7 @@
         </w:rPr>
         <w:t xml:space="preserve">Related terms cause the rest of the confusion. Rewording swaps individual words for synonyms and leaves the sentence alone. Summarising keeps only the main points, so it is always shorter than the source. Rephrasing is the loosest of the lot: Scribbr's guide to </w:t>
       </w:r>
-      <w:hyperlink w:history="1" r:id="rIdaziu9tasjjudsqzzncxjf">
+      <w:hyperlink w:history="1" r:id="rIddjj7vzbkxwzvj2lyelprw">
         <w:r>
           <w:rPr>
             <w:rStyle w:val="Hyperlink"/>
@@ -1457,7 +1457,7 @@
         </w:rPr>
         <w:t xml:space="preserve">Scribbr's guidance on </w:t>
       </w:r>
-      <w:hyperlink w:history="1" r:id="rIduzwaidlj4kqv-isjfnhvi">
+      <w:hyperlink w:history="1" r:id="rIdqpqyoher1ilngtuqlgc-q">
         <w:r>
           <w:rPr>
             <w:rStyle w:val="Hyperlink"/>
@@ -1567,7 +1567,7 @@
         </w:rPr>
         <w:t xml:space="preserve"> On 27 August 2025, Turnitin </w:t>
       </w:r>
-      <w:hyperlink w:history="1" r:id="rIdlzk277doxabwcrl68gso8">
+      <w:hyperlink w:history="1" r:id="rIdlcvqz5gybnhki4hm7gftc">
         <w:r>
           <w:rPr>
             <w:rStyle w:val="Hyperlink"/>
@@ -1618,7 +1618,7 @@
         </w:rPr>
         <w:t xml:space="preserve"> Google's </w:t>
       </w:r>
-      <w:hyperlink w:history="1" r:id="rId0w7zrhfwlukntjnxczpjl">
+      <w:hyperlink w:history="1" r:id="rIduxip_h5saiudch7enculf">
         <w:r>
           <w:rPr>
             <w:rStyle w:val="Hyperlink"/>
@@ -1724,7 +1724,7 @@
         </w:rPr>
         <w:t xml:space="preserve">My guide on </w:t>
       </w:r>
-      <w:hyperlink w:history="1" r:id="rIdwlvmplqam5len8ecphfmw">
+      <w:hyperlink w:history="1" r:id="rIdfoh9hkfnctqvvawnoiccm">
         <w:r>
           <w:rPr>
             <w:rStyle w:val="Hyperlink"/>
@@ -1777,7 +1777,7 @@
         </w:rPr>
         <w:t xml:space="preserve">Google doesn't penalise text for being paraphrased, rewritten or AI-assisted. Its </w:t>
       </w:r>
-      <w:hyperlink w:history="1" r:id="rIdexrfbuotowzrsu_uncfbo">
+      <w:hyperlink w:history="1" r:id="rIdwopdqymf6ghvuv4csd7t-">
         <w:r>
           <w:rPr>
             <w:rStyle w:val="Hyperlink"/>
@@ -1797,9 +1797,9 @@
           <w:sz w:val="24"/>
           <w:szCs w:val="24"/>
         </w:rPr>
-        <w:t xml:space="preserve"> says it rewards high-quality content however it's produced. It rates pages low when they add nothing new. The January 2025 update to Google's Search Quality Rater Guidelines gives the Lowest rating when almost all main content is "copied or paraphrased with no effort or added value", as </w:t>
-      </w:r>
-      <w:hyperlink w:history="1" r:id="rIdmd2of15dqxmsmlmk4iim6">
+        <w:t xml:space="preserve"> says it rewards high-quality content however it's produced. It rates pages low when they add nothing new. Google's </w:t>
+      </w:r>
+      <w:hyperlink w:history="1" r:id="rIdjitaje3e1ecenopgiapga">
         <w:r>
           <w:rPr>
             <w:rStyle w:val="Hyperlink"/>
@@ -1809,7 +1809,7 @@
             <w:szCs w:val="24"/>
             <w:u w:val="single"/>
           </w:rPr>
-          <w:t xml:space="preserve">PPC Land's summary of the update</w:t>
+          <w:t xml:space="preserve">Search Quality Rater Guidelines</w:t>
         </w:r>
       </w:hyperlink>
       <w:r>
@@ -1819,7 +1819,7 @@
           <w:sz w:val="24"/>
           <w:szCs w:val="24"/>
         </w:rPr>
-        <w:t xml:space="preserve"> quotes.</w:t>
+        <w:t xml:space="preserve"> (current version dated 11 September 2025) tell raters to give the Lowest rating when all or almost all main content is "copied, paraphrased, embedded, or reposted from other sources with little to no effort, little to no originality, and little to no added value for website visitors". This rule first appeared in the January 2025 update.</w:t>
       </w:r>
     </w:p>
     <w:p>
@@ -2040,7 +2040,7 @@
         </w:rPr>
         <w:t xml:space="preserve"> – the most flexible for true rewriting, because you can give them a brief. I compared them in </w:t>
       </w:r>
-      <w:hyperlink w:history="1" r:id="rIdgl2c30eezbr8foimuc9dn">
+      <w:hyperlink w:history="1" r:id="rIdheuj1qkmunz7vg-s4jnu8">
         <w:r>
           <w:rPr>
             <w:rStyle w:val="Hyperlink"/>
@@ -2076,7 +2076,7 @@
         </w:rPr>
         <w:t xml:space="preserve">After my test, I rebuilt our own </w:t>
       </w:r>
-      <w:hyperlink w:history="1" r:id="rIdjjjxftvm_ysz17iqrn5wr">
+      <w:hyperlink w:history="1" r:id="rId7xfkl6gkwygukxufsxi6i">
         <w:r>
           <w:rPr>
             <w:rStyle w:val="Hyperlink"/>
@@ -2170,7 +2170,7 @@
         </w:rPr>
         <w:t xml:space="preserve">Whatever you use, run the result through the </w:t>
       </w:r>
-      <w:hyperlink w:history="1" r:id="rIdghvucvhxxccny_8edyia3">
+      <w:hyperlink w:history="1" r:id="rId4m_ixuinnihe4bx_yrtly">
         <w:r>
           <w:rPr>
             <w:rStyle w:val="Hyperlink"/>
@@ -2378,7 +2378,7 @@
         </w:rPr>
         <w:t xml:space="preserve">For the full process from draft to publish, see the </w:t>
       </w:r>
-      <w:hyperlink w:history="1" r:id="rIdqb0bjp6rvlkzfe877-3ce">
+      <w:hyperlink w:history="1" r:id="rIdz7adqif1e2uyiun-xktsl">
         <w:r>
           <w:rPr>
             <w:rStyle w:val="Hyperlink"/>

</xml_diff>

<commit_message>
Rebuild AI detector as v2 pattern checker, update Google AI detection article with round-2 test, fix cannibalisation with paraphrasing article, add keyword ownership map
Co-Authored-By: Claude Opus 5.5 <noreply@anthropic.com>
Claude-Session: https://claude.ai/code/session_01GQXcnZLn4f9MkUS7SEqp5J
</commit_message>
<xml_diff>
--- a/blog-content/AI-Paraphrasing-vs-Rewriting.docx
+++ b/blog-content/AI-Paraphrasing-vs-Rewriting.docx
@@ -622,7 +622,7 @@
         </w:rPr>
         <w:t xml:space="preserve">Related terms cause the rest of the confusion. Rewording swaps individual words for synonyms and leaves the sentence alone. Summarising keeps only the main points, so it is always shorter than the source. Rephrasing is the loosest of the lot: Scribbr's guide to </w:t>
       </w:r>
-      <w:hyperlink w:history="1" r:id="rIddjj7vzbkxwzvj2lyelprw">
+      <w:hyperlink w:history="1" r:id="rIdkhvcg-tys6glmolgqf4tf">
         <w:r>
           <w:rPr>
             <w:rStyle w:val="Hyperlink"/>
@@ -1457,7 +1457,7 @@
         </w:rPr>
         <w:t xml:space="preserve">Scribbr's guidance on </w:t>
       </w:r>
-      <w:hyperlink w:history="1" r:id="rIdqpqyoher1ilngtuqlgc-q">
+      <w:hyperlink w:history="1" r:id="rIdxbd0fysbidkmiz9yhl6sa">
         <w:r>
           <w:rPr>
             <w:rStyle w:val="Hyperlink"/>
@@ -1567,7 +1567,7 @@
         </w:rPr>
         <w:t xml:space="preserve"> On 27 August 2025, Turnitin </w:t>
       </w:r>
-      <w:hyperlink w:history="1" r:id="rIdlcvqz5gybnhki4hm7gftc">
+      <w:hyperlink w:history="1" r:id="rIdocs65dl6fbafn35vlbmc7">
         <w:r>
           <w:rPr>
             <w:rStyle w:val="Hyperlink"/>
@@ -1618,7 +1618,7 @@
         </w:rPr>
         <w:t xml:space="preserve"> Google's </w:t>
       </w:r>
-      <w:hyperlink w:history="1" r:id="rIduxip_h5saiudch7enculf">
+      <w:hyperlink w:history="1" r:id="rIdonks0ljlieovgdj-rkd03">
         <w:r>
           <w:rPr>
             <w:rStyle w:val="Hyperlink"/>
@@ -1724,7 +1724,7 @@
         </w:rPr>
         <w:t xml:space="preserve">My guide on </w:t>
       </w:r>
-      <w:hyperlink w:history="1" r:id="rIdfoh9hkfnctqvvawnoiccm">
+      <w:hyperlink w:history="1" r:id="rIdk2dbtusivinhncsicfgtd">
         <w:r>
           <w:rPr>
             <w:rStyle w:val="Hyperlink"/>
@@ -1761,45 +1761,23 @@
           <w:sz w:val="36"/>
           <w:szCs w:val="36"/>
         </w:rPr>
-        <w:t xml:space="preserve">Does Google penalise paraphrased or rewritten content?</w:t>
-      </w:r>
-    </w:p>
-    <w:p>
-      <w:pPr>
-        <w:spacing w:after="160"/>
-      </w:pPr>
-      <w:r>
-        <w:rPr>
-          <w:rFonts w:ascii="Calibri" w:cs="Calibri" w:eastAsia="Calibri" w:hAnsi="Calibri"/>
-          <w:color w:val="333333"/>
-          <w:sz w:val="24"/>
-          <w:szCs w:val="24"/>
-        </w:rPr>
-        <w:t xml:space="preserve">Google doesn't penalise text for being paraphrased, rewritten or AI-assisted. Its </w:t>
-      </w:r>
-      <w:hyperlink w:history="1" r:id="rIdwopdqymf6ghvuv4csd7t-">
-        <w:r>
-          <w:rPr>
-            <w:rStyle w:val="Hyperlink"/>
-            <w:rFonts w:ascii="Calibri" w:cs="Calibri" w:eastAsia="Calibri" w:hAnsi="Calibri"/>
-            <w:color w:val="0563C1"/>
-            <w:sz w:val="24"/>
-            <w:szCs w:val="24"/>
-            <w:u w:val="single"/>
-          </w:rPr>
-          <w:t xml:space="preserve">February 2023 guidance on AI content</w:t>
-        </w:r>
-      </w:hyperlink>
-      <w:r>
-        <w:rPr>
-          <w:rFonts w:ascii="Calibri" w:cs="Calibri" w:eastAsia="Calibri" w:hAnsi="Calibri"/>
-          <w:color w:val="333333"/>
-          <w:sz w:val="24"/>
-          <w:szCs w:val="24"/>
-        </w:rPr>
-        <w:t xml:space="preserve"> says it rewards high-quality content however it's produced. It rates pages low when they add nothing new. Google's </w:t>
-      </w:r>
-      <w:hyperlink w:history="1" r:id="rIdjitaje3e1ecenopgiapga">
+        <w:t xml:space="preserve">Does Google penalise paraphrased content?</w:t>
+      </w:r>
+    </w:p>
+    <w:p>
+      <w:pPr>
+        <w:spacing w:after="160"/>
+      </w:pPr>
+      <w:r>
+        <w:rPr>
+          <w:rFonts w:ascii="Calibri" w:cs="Calibri" w:eastAsia="Calibri" w:hAnsi="Calibri"/>
+          <w:color w:val="333333"/>
+          <w:sz w:val="24"/>
+          <w:szCs w:val="24"/>
+        </w:rPr>
+        <w:t xml:space="preserve">Not for being paraphrased. Google's </w:t>
+      </w:r>
+      <w:hyperlink w:history="1" r:id="rIddwqzt_fzr-osl8ap5ci_i">
         <w:r>
           <w:rPr>
             <w:rStyle w:val="Hyperlink"/>
@@ -1819,22 +1797,35 @@
           <w:sz w:val="24"/>
           <w:szCs w:val="24"/>
         </w:rPr>
-        <w:t xml:space="preserve"> (current version dated 11 September 2025) tell raters to give the Lowest rating when all or almost all main content is "copied, paraphrased, embedded, or reposted from other sources with little to no effort, little to no originality, and little to no added value for website visitors". This rule first appeared in the January 2025 update.</w:t>
-      </w:r>
-    </w:p>
-    <w:p>
-      <w:pPr>
-        <w:spacing w:after="160"/>
-      </w:pPr>
-      <w:r>
-        <w:rPr>
-          <w:rFonts w:ascii="Calibri" w:cs="Calibri" w:eastAsia="Calibri" w:hAnsi="Calibri"/>
-          <w:color w:val="333333"/>
-          <w:sz w:val="24"/>
-          <w:szCs w:val="24"/>
-        </w:rPr>
-        <w:t xml:space="preserve">So the question isn't "paraphrase or rewrite?" It's "what did I add?" For a blog, that usually means a rewrite plus something the source didn't have: your test, your data, your example.</w:t>
-      </w:r>
+        <w:t xml:space="preserve"> (current version dated 11 September 2025) give the Lowest rating when almost all of a page is "copied, paraphrased, embedded, or reposted from other sources with little to no effort, little to no originality, and little to no added value". The problem is the missing value, not the method.</w:t>
+      </w:r>
+    </w:p>
+    <w:p>
+      <w:pPr>
+        <w:spacing w:after="160"/>
+      </w:pPr>
+      <w:r>
+        <w:rPr>
+          <w:rFonts w:ascii="Calibri" w:cs="Calibri" w:eastAsia="Calibri" w:hAnsi="Calibri"/>
+          <w:color w:val="333333"/>
+          <w:sz w:val="24"/>
+          <w:szCs w:val="24"/>
+        </w:rPr>
+        <w:t xml:space="preserve">So the question isn't "paraphrase or rewrite?" It's "what did I add?" For a blog, that usually means a rewrite plus something the source didn't have: your test, your data, your example. For how Google treats AI-assisted writing more broadly, see </w:t>
+      </w:r>
+      <w:hyperlink w:history="1" r:id="rIdzpqeerbpx6oj9otvzdfoi">
+        <w:r>
+          <w:rPr>
+            <w:rStyle w:val="Hyperlink"/>
+            <w:rFonts w:ascii="Calibri" w:cs="Calibri" w:eastAsia="Calibri" w:hAnsi="Calibri"/>
+            <w:color w:val="0563C1"/>
+            <w:sz w:val="24"/>
+            <w:szCs w:val="24"/>
+            <w:u w:val="single"/>
+          </w:rPr>
+          <w:t xml:space="preserve">can Google detect AI content?</w:t>
+        </w:r>
+      </w:hyperlink>
     </w:p>
     <w:p>
       <w:pPr>
@@ -2040,7 +2031,7 @@
         </w:rPr>
         <w:t xml:space="preserve"> – the most flexible for true rewriting, because you can give them a brief. I compared them in </w:t>
       </w:r>
-      <w:hyperlink w:history="1" r:id="rIdheuj1qkmunz7vg-s4jnu8">
+      <w:hyperlink w:history="1" r:id="rIdeozpbjysm-mjdmnukchpx">
         <w:r>
           <w:rPr>
             <w:rStyle w:val="Hyperlink"/>
@@ -2076,7 +2067,7 @@
         </w:rPr>
         <w:t xml:space="preserve">After my test, I rebuilt our own </w:t>
       </w:r>
-      <w:hyperlink w:history="1" r:id="rId7xfkl6gkwygukxufsxi6i">
+      <w:hyperlink w:history="1" r:id="rId4l7un4wibadu7oq5qbthf">
         <w:r>
           <w:rPr>
             <w:rStyle w:val="Hyperlink"/>
@@ -2170,7 +2161,7 @@
         </w:rPr>
         <w:t xml:space="preserve">Whatever you use, run the result through the </w:t>
       </w:r>
-      <w:hyperlink w:history="1" r:id="rId4m_ixuinnihe4bx_yrtly">
+      <w:hyperlink w:history="1" r:id="rIdmnuho2bo9kvofwy9brqsm">
         <w:r>
           <w:rPr>
             <w:rStyle w:val="Hyperlink"/>
@@ -2378,7 +2369,7 @@
         </w:rPr>
         <w:t xml:space="preserve">For the full process from draft to publish, see the </w:t>
       </w:r>
-      <w:hyperlink w:history="1" r:id="rIdz7adqif1e2uyiun-xktsl">
+      <w:hyperlink w:history="1" r:id="rIdsbk9eyzip5zqxqyqezvas">
         <w:r>
           <w:rPr>
             <w:rStyle w:val="Hyperlink"/>

</xml_diff>

<commit_message>
Update cluster plan with pillar status
Co-Authored-By: Claude Opus 5.5 <noreply@anthropic.com>
Claude-Session: https://claude.ai/code/session_01GQXcnZLn4f9MkUS7SEqp5J
</commit_message>
<xml_diff>
--- a/blog-content/AI-Paraphrasing-vs-Rewriting.docx
+++ b/blog-content/AI-Paraphrasing-vs-Rewriting.docx
@@ -622,7 +622,7 @@
         </w:rPr>
         <w:t xml:space="preserve">Related terms cause the rest of the confusion. Rewording swaps individual words for synonyms and leaves the sentence alone. Summarising keeps only the main points, so it is always shorter than the source. Rephrasing is the loosest of the lot: Scribbr's guide to </w:t>
       </w:r>
-      <w:hyperlink w:history="1" r:id="rId8d-is4-dvi9hozkfbfok0">
+      <w:hyperlink w:history="1" r:id="rIdnwoog_ulgzdj3snzusgmq">
         <w:r>
           <w:rPr>
             <w:rStyle w:val="Hyperlink"/>
@@ -1457,7 +1457,7 @@
         </w:rPr>
         <w:t xml:space="preserve">Scribbr's guidance on </w:t>
       </w:r>
-      <w:hyperlink w:history="1" r:id="rIdvr1jsreogntlcnvdzodcb">
+      <w:hyperlink w:history="1" r:id="rIdxwe7mck3mky8q7hnni9i5">
         <w:r>
           <w:rPr>
             <w:rStyle w:val="Hyperlink"/>
@@ -1567,7 +1567,7 @@
         </w:rPr>
         <w:t xml:space="preserve"> On 27 August 2025, Turnitin </w:t>
       </w:r>
-      <w:hyperlink w:history="1" r:id="rIdfrlwh-k_b6eexelavoknt">
+      <w:hyperlink w:history="1" r:id="rIdhqyzbgncdopqglvtex0bn">
         <w:r>
           <w:rPr>
             <w:rStyle w:val="Hyperlink"/>
@@ -1618,7 +1618,7 @@
         </w:rPr>
         <w:t xml:space="preserve"> Google's </w:t>
       </w:r>
-      <w:hyperlink w:history="1" r:id="rId2zkgme3io_dileeilspmi">
+      <w:hyperlink w:history="1" r:id="rIdnjseastb89cwylvyljfwn">
         <w:r>
           <w:rPr>
             <w:rStyle w:val="Hyperlink"/>
@@ -1724,7 +1724,7 @@
         </w:rPr>
         <w:t xml:space="preserve">My guide on </w:t>
       </w:r>
-      <w:hyperlink w:history="1" r:id="rIdpli_oa2q13-vc82bgyqa8">
+      <w:hyperlink w:history="1" r:id="rId56d1hgp1-zi_vyzacidzw">
         <w:r>
           <w:rPr>
             <w:rStyle w:val="Hyperlink"/>
@@ -1777,7 +1777,7 @@
         </w:rPr>
         <w:t xml:space="preserve">Not for being paraphrased. Google's </w:t>
       </w:r>
-      <w:hyperlink w:history="1" r:id="rIdsycdl3ehxrnlnt2rjtn5j">
+      <w:hyperlink w:history="1" r:id="rIdv3gcgfa8xyhkud-qfi4zs">
         <w:r>
           <w:rPr>
             <w:rStyle w:val="Hyperlink"/>
@@ -1813,7 +1813,7 @@
         </w:rPr>
         <w:t xml:space="preserve">So the question isn't "paraphrase or rewrite?" It's "what did I add?" For a blog, that usually means a rewrite plus something the source didn't have: your test, your data, your example. For how Google treats AI-assisted writing more broadly, see </w:t>
       </w:r>
-      <w:hyperlink w:history="1" r:id="rIdjf8bta07ydwyyzultsu_p">
+      <w:hyperlink w:history="1" r:id="rIdjkgzwjfecn7uysbytyu7f">
         <w:r>
           <w:rPr>
             <w:rStyle w:val="Hyperlink"/>
@@ -2031,7 +2031,7 @@
         </w:rPr>
         <w:t xml:space="preserve"> – the most flexible for true rewriting, because you can give them a brief. I compared them in </w:t>
       </w:r>
-      <w:hyperlink w:history="1" r:id="rIdumlrgmj1iuokp3p7bivzw">
+      <w:hyperlink w:history="1" r:id="rIdhzhxj0fqxdwr-6lofhkvn">
         <w:r>
           <w:rPr>
             <w:rStyle w:val="Hyperlink"/>
@@ -2067,7 +2067,7 @@
         </w:rPr>
         <w:t xml:space="preserve">After my test, I rebuilt our own </w:t>
       </w:r>
-      <w:hyperlink w:history="1" r:id="rIddgqmxzlmjpvl-exejigrd">
+      <w:hyperlink w:history="1" r:id="rIduyfevssizw6t82ga1hhmw">
         <w:r>
           <w:rPr>
             <w:rStyle w:val="Hyperlink"/>
@@ -2161,7 +2161,7 @@
         </w:rPr>
         <w:t xml:space="preserve">Whatever you use, run the result through the </w:t>
       </w:r>
-      <w:hyperlink w:history="1" r:id="rIdnoomkcxrnwa80tyflkh9-">
+      <w:hyperlink w:history="1" r:id="rIdbr2vpo3mwy_sg3m-gupcr">
         <w:r>
           <w:rPr>
             <w:rStyle w:val="Hyperlink"/>
@@ -2369,7 +2369,7 @@
         </w:rPr>
         <w:t xml:space="preserve">For the full process from draft to publish, see the </w:t>
       </w:r>
-      <w:hyperlink w:history="1" r:id="rIdcvkjcleu08ldzfc9ij-jv">
+      <w:hyperlink w:history="1" r:id="rIdmbg2t_monzbvs7p2y4az7">
         <w:r>
           <w:rPr>
             <w:rStyle w:val="Hyperlink"/>
@@ -2405,7 +2405,7 @@
         </w:rPr>
         <w:t xml:space="preserve">For the bigger picture on tools, SEO and Google's rules, start with our </w:t>
       </w:r>
-      <w:hyperlink w:history="1" r:id="rIdinvi_canugazr3-htyouo">
+      <w:hyperlink w:history="1" r:id="rIdw9ll5cwsfb4xwntppvcz_">
         <w:r>
           <w:rPr>
             <w:rStyle w:val="Hyperlink"/>
@@ -2427,7 +2427,7 @@
         </w:rPr>
         <w:t xml:space="preserve">. If you'd rather hand the writing over, see our </w:t>
       </w:r>
-      <w:hyperlink w:history="1" r:id="rIdanb59ktqpeuss75mnbig2">
+      <w:hyperlink w:history="1" r:id="rIdpwpkhnzmxejg0qsjdpnd5">
         <w:r>
           <w:rPr>
             <w:rStyle w:val="Hyperlink"/>

</xml_diff>